<commit_message>
Contrato 2K fijo, como Entry/Mid/High: sin condición de la 2ª cuota ni registro de la llamada
Se sacan la Cláusula Cuarta (meta de ingresos), el 18.2 y los Anexos II y III, y se renumera de la
Quinta a la Décimo Octava (referencias cruzadas revisadas). Las tres cuotas quedan fijas con sus
fechas (firma, +1 y +2 meses). El alta ya no pide link, ingresos ni meta. Plantilla nueva en ZapSign:
ZAPSIGN_TEMPLATE_2K=a4074080-… (la anterior se borró). Las columnas call_link/current_income/
target_income quedan en la base sin uso.

Co-Authored-By: Claude Opus 5.5 <noreply@anthropic.com>
</commit_message>
<xml_diff>
--- a/contratos/Contrato 2K ATV.docx
+++ b/contratos/Contrato 2K ATV.docx
@@ -122,7 +122,7 @@
     </w:p>
     <w:p>
       <w:r>
-        <w:t>(a) Pago de honorarios: abonar a LA EMPRESA la contraprestación económica total en los montos, plazos y formas establecidos en las CLÁUSULAS TERCERA y CUARTA.</w:t>
+        <w:t>(a) Pago de honorarios: abonar a LA EMPRESA la contraprestación económica total en los montos, plazos y formas establecidos en la CLÁUSULA TERCERA.</w:t>
       </w:r>
     </w:p>
     <w:p>
@@ -132,7 +132,7 @@
     </w:p>
     <w:p>
       <w:r>
-        <w:t>(c) Provisión de información: suministrar en tiempo y forma toda la información veraz, documentación, antecedentes y demás insumos que LA EMPRESA requiera para la correcta ejecución del servicio detallado en el Anexo I, incluyendo los registros comerciales necesarios para la verificación prevista en la CLÁUSULA CUARTA.</w:t>
+        <w:t>(c) Provisión de información: suministrar en tiempo y forma toda la información veraz, documentación, antecedentes y demás insumos que LA EMPRESA requiera para la correcta ejecución del servicio detallado en el Anexo I.</w:t>
       </w:r>
     </w:p>
     <w:p>
@@ -184,12 +184,12 @@
     </w:p>
     <w:p>
       <w:r>
-        <w:t>(b) SEGUNDA CUOTA: USD 500 (QUINIENTOS DÓLARES ESTADOUNIDENSES), exigible el {{FECHA_CUOTA_2}}, SUJETA a la condición de resultados prevista en la CLÁUSULA CUARTA y en el Anexo II.</w:t>
+        <w:t>(b) SEGUNDA CUOTA: USD 500 (QUINIENTOS DÓLARES ESTADOUNIDENSES), exigible el {{FECHA_CUOTA_2}}.</w:t>
       </w:r>
     </w:p>
     <w:p>
       <w:r>
-        <w:t>(c) TERCERA CUOTA: USD 1.300 (MIL TRESCIENTOS DÓLARES ESTADOUNIDENSES), exigible el {{FECHA_CUOTA_3}}, NO sujeta a condición alguna.</w:t>
+        <w:t>(c) TERCERA CUOTA: USD 1.300 (MIL TRESCIENTOS DÓLARES ESTADOUNIDENSES), exigible el {{FECHA_CUOTA_3}}.</w:t>
       </w:r>
     </w:p>
     <w:p>
@@ -215,7 +215,7 @@
     </w:p>
     <w:p>
       <w:r>
-        <w:t>Todo pago se considerará efectuado en la fecha en que los fondos ingresen efectivamente a la billetera virtual de LA EMPRESA. El acceso al servicio solo se habilita tras el ingreso efectivo de la cuota correspondiente. LA EMPRESA queda exonerada de toda responsabilidad por errores en el procesamiento, rechazos o cobros fallidos derivados de la falta de notificación oportuna. Los pagos fallidos por causas imputables a EL CONTRATANTE se considerarán incumplimiento en los términos de la CLÁUSULA DÉCIMO TERCERA.</w:t>
+        <w:t>Todo pago se considerará efectuado en la fecha en que los fondos ingresen efectivamente a la billetera virtual de LA EMPRESA. El acceso al servicio solo se habilita tras el ingreso efectivo de la cuota correspondiente. LA EMPRESA queda exonerada de toda responsabilidad por errores en el procesamiento, rechazos o cobros fallidos derivados de la falta de notificación oportuna. Los pagos fallidos por causas imputables a EL CONTRATANTE se considerarán incumplimiento en los términos de la CLÁUSULA DÉCIMO SEGUNDA.</w:t>
       </w:r>
     </w:p>
     <w:p>
@@ -289,7 +289,7 @@
         <w:rPr>
           <w:b/>
         </w:rPr>
-        <w:t>CLÁUSULA CUARTA: CONDICIÓN DE RESULTADOS VINCULADA A LA SEGUNDA CUOTA</w:t>
+        <w:t>CLÁUSULA CUARTA: ACEPTACIÓN DE LA RESPONSABILIDAD FINANCIERA</w:t>
       </w:r>
     </w:p>
     <w:p>
@@ -297,90 +297,12 @@
         <w:rPr>
           <w:b/>
         </w:rPr>
-        <w:t>4.1. Condición.</w:t>
+        <w:t>4.1. Responsabilidad financiera.</w:t>
       </w:r>
     </w:p>
     <w:p>
       <w:r>
-        <w:t>La exigibilidad de la SEGUNDA CUOTA (USD 500) queda sujeta a que, dentro de los primeros TREINTA (30) días corridos contados desde la fecha del primer pago, se verifique el incremento de ingresos previsto en el Anexo II del presente contrato.</w:t>
-      </w:r>
-    </w:p>
-    <w:p>
-      <w:r>
-        <w:rPr>
-          <w:b/>
-        </w:rPr>
-        <w:t>4.2. Métrica aplicable.</w:t>
-      </w:r>
-    </w:p>
-    <w:p>
-      <w:r>
-        <w:t>La condición se entenderá verificada cuando EL CONTRATANTE acredite, conforme el procedimiento de verificación del Anexo II, un incremento de al menos USD 500 (QUINIENTOS DÓLARES ESTADOUNIDENSES) en sus ingresos mensuales percibidos de los clientes con los cuales aplica el Programa, medido sobre la línea base declarada en el Anexo II.</w:t>
-      </w:r>
-    </w:p>
-    <w:p>
-      <w:r>
-        <w:rPr>
-          <w:b/>
-        </w:rPr>
-        <w:t>4.3. Requisito de implementación.</w:t>
-      </w:r>
-    </w:p>
-    <w:p>
-      <w:r>
-        <w:t>La condición prevista en la presente cláusula solo opera si EL CONTRATANTE ha cumplido, a la fecha de verificación, con: (a) la asistencia a las tres (3) sesiones individuales previstas en el Anexo I, o su reprogramación conforme la CLÁUSULA OCTAVA; y (b) la ejecución de las acciones del roadmap personalizado definido en la primera sesión. Si EL CONTRATANTE incumple cualquiera de dichos deberes de implementación, la condición de resultados se tendrá por cumplida a todos los efectos legales y la SEGUNDA CUOTA será plenamente exigible en su término original.</w:t>
-      </w:r>
-    </w:p>
-    <w:p>
-      <w:r>
-        <w:rPr>
-          <w:b/>
-        </w:rPr>
-        <w:t>4.4. Verificación.</w:t>
-      </w:r>
-    </w:p>
-    <w:p>
-      <w:r>
-        <w:t>La verificación de la condición se realizará sobre los registros comerciales de EL CONTRATANTE, incluyendo, sin limitación, su CRM, plataforma de mensajería, plataformas de cobro y demás documentación que EL CONTRATANTE está obligado a proveer conforme la CLÁUSULA NOVENA. Ante desacuerdo entre LAS PARTES sobre la medición, estas resolverán de buena fe sobre la base de la documentación objetiva disponible.</w:t>
-      </w:r>
-    </w:p>
-    <w:p>
-      <w:r>
-        <w:rPr>
-          <w:b/>
-        </w:rPr>
-        <w:t>4.5. Efectos si la condición NO se verifica.</w:t>
-      </w:r>
-    </w:p>
-    <w:p>
-      <w:r>
-        <w:t>Si vencido el plazo de TREINTA (30) días corridos la condición no se verifica por causas no imputables a EL CONTRATANTE conforme el apartado 4.3: (a) la SEGUNDA CUOTA no será exigible; (b) el Programa concluirá anticipadamente a esa fecha; y (c) EL CONTRATANTE conservará el acceso a los materiales ya provistos hasta esa fecha, sin derecho a las sesiones restantes, sin prórroga del acompañamiento y sin derecho a reembolso de la PRIMERA CUOTA.</w:t>
-      </w:r>
-    </w:p>
-    <w:p>
-      <w:r>
-        <w:rPr>
-          <w:b/>
-        </w:rPr>
-        <w:t>4.6. Efectos si la condición SE verifica y la cuota no se abona.</w:t>
-      </w:r>
-    </w:p>
-    <w:p>
-      <w:r>
-        <w:t>Si la condición se verifica y EL CONTRATANTE no abona la SEGUNDA CUOTA en su término, se configurará mora. En tal supuesto, EL CONTRATANTE conservará el acceso a los materiales, pero el acompañamiento, el feedback y las sesiones quedarán suspendidos hasta la regularización integral del pago, sin perjuicio de las acciones de cobro previstas en la CLÁUSULA TERCERA y de la resolución contractual conforme la CLÁUSULA DÉCIMO TERCERA.</w:t>
-      </w:r>
-    </w:p>
-    <w:p>
-      <w:r>
-        <w:rPr>
-          <w:b/>
-        </w:rPr>
-        <w:t>4.7. Naturaleza de la condición.</w:t>
-      </w:r>
-    </w:p>
-    <w:p>
-      <w:r>
-        <w:t>LAS PARTES reconocen que la presente cláusula constituye un mecanismo comercial de alineación de incentivos y de reducción de la barrera de entrada, y no una garantía de resultados a favor de EL CONTRATANTE, sin perjuicio de lo dispuesto en la CLÁUSULA SÉPTIMA.</w:t>
+        <w:t>EL CONTRATANTE reconoce que la contratación de los servicios implica una responsabilidad financiera completa. La decisión de no utilizar total o parcialmente los servicios, o interrumpir su participación, no lo exime del cumplimiento de las obligaciones económicas asumidas en las CLÁUSULAS SEGUNDA y TERCERA, ni genera a su favor derecho a reembolso alguno.</w:t>
       </w:r>
     </w:p>
     <w:p>
@@ -391,7 +313,7 @@
         <w:rPr>
           <w:b/>
         </w:rPr>
-        <w:t>CLÁUSULA QUINTA: ACEPTACIÓN DE LA RESPONSABILIDAD FINANCIERA</w:t>
+        <w:t>CLÁUSULA QUINTA: PLAZO DE EJECUCIÓN Y VIGENCIA</w:t>
       </w:r>
     </w:p>
     <w:p>
@@ -399,12 +321,12 @@
         <w:rPr>
           <w:b/>
         </w:rPr>
-        <w:t>5.1. Responsabilidad financiera.</w:t>
+        <w:t>5.1. Servicio principal.</w:t>
       </w:r>
     </w:p>
     <w:p>
       <w:r>
-        <w:t>EL CONTRATANTE reconoce que la contratación de los servicios implica una responsabilidad financiera completa. La decisión de no utilizar total o parcialmente los servicios, o interrumpir su participación, no lo exime del cumplimiento de las obligaciones económicas asumidas en las CLÁUSULAS SEGUNDA, TERCERA y CUARTA, ni genera a su favor derecho a reembolso alguno. La estructura de pagos condicionales prevista en la CLÁUSULA CUARTA no modifica ni limita la presente obligación.</w:t>
+        <w:t>Los servicios contratados bajo el presente contrato se prestarán por un plazo máximo de TRES (3) meses consecutivos, contados desde la fecha del primer pago o desde la firma del contrato, lo que ocurra primero.</w:t>
       </w:r>
     </w:p>
     <w:p>
@@ -415,7 +337,7 @@
         <w:rPr>
           <w:b/>
         </w:rPr>
-        <w:t>CLÁUSULA SEXTA: PLAZO DE EJECUCIÓN Y VIGENCIA</w:t>
+        <w:t>CLÁUSULA SEXTA: NATURALEZA DE LAS OBLIGACIONES DE LA EMPRESA</w:t>
       </w:r>
     </w:p>
     <w:p>
@@ -423,31 +345,7 @@
         <w:rPr>
           <w:b/>
         </w:rPr>
-        <w:t>6.1. Servicio principal.</w:t>
-      </w:r>
-    </w:p>
-    <w:p>
-      <w:r>
-        <w:t>Los servicios contratados bajo el presente contrato se prestarán por un plazo máximo de TRES (3) meses consecutivos, contados desde la fecha del primer pago o desde la firma del contrato, lo que ocurra primero. Lo dispuesto en el apartado 4.5 podrá anticipar la finalización del Programa.</w:t>
-      </w:r>
-    </w:p>
-    <w:p>
-      <w:pPr>
-        <w:spacing w:before="280"/>
-      </w:pPr>
-      <w:r>
-        <w:rPr>
-          <w:b/>
-        </w:rPr>
-        <w:t>CLÁUSULA SÉPTIMA: NATURALEZA DE LAS OBLIGACIONES DE LA EMPRESA</w:t>
-      </w:r>
-    </w:p>
-    <w:p>
-      <w:r>
-        <w:rPr>
-          <w:b/>
-        </w:rPr>
-        <w:t>7.1. Obligación de medios.</w:t>
+        <w:t>6.1. Obligación de medios.</w:t>
       </w:r>
     </w:p>
     <w:p>
@@ -460,12 +358,12 @@
         <w:rPr>
           <w:b/>
         </w:rPr>
-        <w:t>7.2. Ausencia de garantías específicas.</w:t>
+        <w:t>6.2. Ausencia de garantías específicas.</w:t>
       </w:r>
     </w:p>
     <w:p>
       <w:r>
-        <w:t>LA EMPRESA no garantiza resultados financieros, laborales, comerciales o de éxito específicos, por lo que la no obtención de los mismos no podrá constituir incumplimiento por parte de LA EMPRESA. Todo testimonio o ejemplo compartido debe interpretarse como referencia y no como promesa de resultados futuros. La condición de resultados prevista en la CLÁUSULA CUARTA es un mecanismo de pago y no constituye garantía, promesa ni obligación de resultado.</w:t>
+        <w:t>LA EMPRESA no garantiza resultados financieros, laborales, comerciales o de éxito específicos, por lo que la no obtención de los mismos no podrá constituir incumplimiento por parte de LA EMPRESA. Todo testimonio o ejemplo compartido debe interpretarse como referencia y no como promesa de resultados futuros.</w:t>
       </w:r>
     </w:p>
     <w:p>
@@ -476,7 +374,7 @@
         <w:rPr>
           <w:b/>
         </w:rPr>
-        <w:t>CLÁUSULA OCTAVA: CONDICIONES DE PARTICIPACIÓN</w:t>
+        <w:t>CLÁUSULA SÉPTIMA: CONDICIONES DE PARTICIPACIÓN</w:t>
       </w:r>
     </w:p>
     <w:p>
@@ -484,7 +382,7 @@
         <w:rPr>
           <w:b/>
         </w:rPr>
-        <w:t>8.1. Declaraciones del CONTRATANTE.</w:t>
+        <w:t>7.1. Declaraciones del CONTRATANTE.</w:t>
       </w:r>
     </w:p>
     <w:p>
@@ -497,7 +395,7 @@
         <w:rPr>
           <w:b/>
         </w:rPr>
-        <w:t>8.2. Naturaleza de la prestación.</w:t>
+        <w:t>7.2. Naturaleza de la prestación.</w:t>
       </w:r>
     </w:p>
     <w:p>
@@ -510,7 +408,7 @@
         <w:rPr>
           <w:b/>
         </w:rPr>
-        <w:t>8.3. Responsabilidad de resultados.</w:t>
+        <w:t>7.3. Responsabilidad de resultados.</w:t>
       </w:r>
     </w:p>
     <w:p>
@@ -523,7 +421,7 @@
         <w:rPr>
           <w:b/>
         </w:rPr>
-        <w:t>8.4. Estándares de conducta y colaboración.</w:t>
+        <w:t>7.4. Estándares de conducta y colaboración.</w:t>
       </w:r>
     </w:p>
     <w:p>
@@ -546,17 +444,17 @@
         <w:rPr>
           <w:b/>
         </w:rPr>
-        <w:t>8.5. Régimen de sesiones y reprogramación de las mismas.</w:t>
+        <w:t>7.5. Régimen de sesiones y reprogramación de las mismas.</w:t>
       </w:r>
     </w:p>
     <w:p>
       <w:r>
-        <w:t>(a) Carga de gestión: EL CONTRATANTE debe gestionar activamente la reserva y uso de las sesiones dentro del plazo de vigencia establecido en la CLÁUSULA SEXTA. La falta de uso por causas imputables a EL CONTRATANTE no generará derecho a prórroga, compensación ni reembolso.</w:t>
+        <w:t>(a) Carga de gestión: EL CONTRATANTE debe gestionar activamente la reserva y uso de las sesiones dentro del plazo de vigencia establecido en la CLÁUSULA QUINTA. La falta de uso por causas imputables a EL CONTRATANTE no generará derecho a prórroga, compensación ni reembolso.</w:t>
       </w:r>
     </w:p>
     <w:p>
       <w:r>
-        <w:t>(b) Aviso de reprogramación: para reprogramar una sesión individual, EL CONTRATANTE deberá notificar a LA EMPRESA con un mínimo de 48 (CUARENTA Y OCHO) horas hábiles de anticipación de acuerdo con lo dispuesto en la CLÁUSULA DÉCIMO SEXTA.</w:t>
+        <w:t>(b) Aviso de reprogramación: para reprogramar una sesión individual, EL CONTRATANTE deberá notificar a LA EMPRESA con un mínimo de 48 (CUARENTA Y OCHO) horas hábiles de anticipación de acuerdo con lo dispuesto en la CLÁUSULA DÉCIMO QUINTA.</w:t>
       </w:r>
     </w:p>
     <w:p>
@@ -572,7 +470,7 @@
         <w:rPr>
           <w:b/>
         </w:rPr>
-        <w:t>CLÁUSULA NOVENA: AUDITORÍA DE INFORMACIÓN Y SEGUIMIENTO COMERCIAL</w:t>
+        <w:t>CLÁUSULA OCTAVA: AUDITORÍA DE INFORMACIÓN Y SEGUIMIENTO COMERCIAL</w:t>
       </w:r>
     </w:p>
     <w:p>
@@ -580,12 +478,12 @@
         <w:rPr>
           <w:b/>
         </w:rPr>
-        <w:t>9.1. Derecho de auditoría.</w:t>
+        <w:t>8.1. Derecho de auditoría.</w:t>
       </w:r>
     </w:p>
     <w:p>
       <w:r>
-        <w:t>Dada la naturaleza de los servicios y el esquema de inversión pactado, EL CONTRATANTE reconoce que LA EMPRESA podrá solicitar en cualquier momento información sobre su situación comercial, el desarrollo de las campañas publicitarias, avances en el proceso de prospección, respuestas a mensajes recibidos y, en particular, los registros de ingresos y comisiones percibidas de los clientes con los cuales aplica el Programa, todo ello a través de los canales oficiales del programa de consultoría. La presente facultad resulta esencial para la verificación de la condición prevista en la CLÁUSULA CUARTA.</w:t>
+        <w:t>Dada la naturaleza de los servicios y el esquema de inversión pactado, EL CONTRATANTE reconoce que LA EMPRESA podrá solicitar en cualquier momento información sobre su situación comercial, el desarrollo de las campañas publicitarias, avances en el proceso de prospección, respuestas a mensajes recibidos, todo ello a través de los canales oficiales del programa de consultoría.</w:t>
       </w:r>
     </w:p>
     <w:p>
@@ -593,7 +491,7 @@
         <w:rPr>
           <w:b/>
         </w:rPr>
-        <w:t>9.2. Deber de respuesta y plazos.</w:t>
+        <w:t>8.2. Deber de respuesta y plazos.</w:t>
       </w:r>
     </w:p>
     <w:p>
@@ -609,7 +507,7 @@
         <w:rPr>
           <w:b/>
         </w:rPr>
-        <w:t>CLÁUSULA DÉCIMA: PROPIEDAD INTELECTUAL Y CONFIDENCIALIDAD</w:t>
+        <w:t>CLÁUSULA NOVENA: PROPIEDAD INTELECTUAL Y CONFIDENCIALIDAD</w:t>
       </w:r>
     </w:p>
     <w:p>
@@ -617,7 +515,7 @@
         <w:rPr>
           <w:b/>
         </w:rPr>
-        <w:t>10.1. Definición de información confidencial.</w:t>
+        <w:t>9.1. Definición de información confidencial.</w:t>
       </w:r>
     </w:p>
     <w:p>
@@ -675,7 +573,7 @@
         <w:rPr>
           <w:b/>
         </w:rPr>
-        <w:t>10.2. Titularidad de la propiedad intelectual.</w:t>
+        <w:t>9.2. Titularidad de la propiedad intelectual.</w:t>
       </w:r>
     </w:p>
     <w:p>
@@ -688,7 +586,7 @@
         <w:rPr>
           <w:b/>
         </w:rPr>
-        <w:t>10.3. Incumplimiento y sanciones.</w:t>
+        <w:t>9.3. Incumplimiento y sanciones.</w:t>
       </w:r>
     </w:p>
     <w:p>
@@ -716,7 +614,7 @@
         <w:rPr>
           <w:b/>
         </w:rPr>
-        <w:t>10.4. Excepciones a la obligación de confidencialidad.</w:t>
+        <w:t>9.4. Excepciones a la obligación de confidencialidad.</w:t>
       </w:r>
     </w:p>
     <w:p>
@@ -774,7 +672,7 @@
         <w:rPr>
           <w:b/>
         </w:rPr>
-        <w:t>10.5. Duración de la obligación.</w:t>
+        <w:t>9.5. Duración de la obligación.</w:t>
       </w:r>
     </w:p>
     <w:p>
@@ -787,7 +685,7 @@
         <w:rPr>
           <w:b/>
         </w:rPr>
-        <w:t>10.6. Uso de imagen y testimonios.</w:t>
+        <w:t>9.6. Uso de imagen y testimonios.</w:t>
       </w:r>
     </w:p>
     <w:p>
@@ -800,7 +698,7 @@
         <w:rPr>
           <w:b/>
         </w:rPr>
-        <w:t>10.7. Registro de comunicaciones.</w:t>
+        <w:t>9.7. Registro de comunicaciones.</w:t>
       </w:r>
     </w:p>
     <w:p>
@@ -816,7 +714,7 @@
         <w:rPr>
           <w:b/>
         </w:rPr>
-        <w:t>CLÁUSULA DÉCIMO PRIMERA: INDEMNIDAD Y LIMITACIÓN DE RESPONSABILIDAD</w:t>
+        <w:t>CLÁUSULA DÉCIMA: INDEMNIDAD Y LIMITACIÓN DE RESPONSABILIDAD</w:t>
       </w:r>
     </w:p>
     <w:p>
@@ -824,7 +722,7 @@
         <w:rPr>
           <w:b/>
         </w:rPr>
-        <w:t>11.1. Obligación de indemnidad de EL CONTRATANTE.</w:t>
+        <w:t>10.1. Obligación de indemnidad de EL CONTRATANTE.</w:t>
       </w:r>
     </w:p>
     <w:p>
@@ -861,7 +759,7 @@
         <w:rPr>
           <w:b/>
         </w:rPr>
-        <w:t>11.2. Obligación de indemnidad de LA EMPRESA.</w:t>
+        <w:t>10.2. Obligación de indemnidad de LA EMPRESA.</w:t>
       </w:r>
     </w:p>
     <w:p>
@@ -890,7 +788,7 @@
         <w:rPr>
           <w:b/>
         </w:rPr>
-        <w:t>11.3. Límite monetario.</w:t>
+        <w:t>10.3. Límite monetario.</w:t>
       </w:r>
     </w:p>
     <w:p>
@@ -903,7 +801,7 @@
         <w:rPr>
           <w:b/>
         </w:rPr>
-        <w:t>11.4. Exclusión de daños indirectos.</w:t>
+        <w:t>10.4. Exclusión de daños indirectos.</w:t>
       </w:r>
     </w:p>
     <w:p>
@@ -916,7 +814,7 @@
         <w:rPr>
           <w:b/>
         </w:rPr>
-        <w:t>11.5. Naturaleza esencial de las limitaciones.</w:t>
+        <w:t>10.5. Naturaleza esencial de las limitaciones.</w:t>
       </w:r>
     </w:p>
     <w:p>
@@ -929,7 +827,7 @@
         <w:rPr>
           <w:b/>
         </w:rPr>
-        <w:t>11.6. Procedimiento.</w:t>
+        <w:t>10.6. Procedimiento.</w:t>
       </w:r>
     </w:p>
     <w:p>
@@ -945,7 +843,7 @@
         <w:rPr>
           <w:b/>
         </w:rPr>
-        <w:t>CLÁUSULA DÉCIMO SEGUNDA: EXIMENTES DE RESPONSABILIDAD</w:t>
+        <w:t>CLÁUSULA DÉCIMO PRIMERA: EXIMENTES DE RESPONSABILIDAD</w:t>
       </w:r>
     </w:p>
     <w:p>
@@ -953,7 +851,7 @@
         <w:rPr>
           <w:b/>
         </w:rPr>
-        <w:t>12.1. Caso fortuito, fuerza mayor e imposibilidad sobreviniente.</w:t>
+        <w:t>11.1. Caso fortuito, fuerza mayor e imposibilidad sobreviniente.</w:t>
       </w:r>
     </w:p>
     <w:p>
@@ -966,7 +864,7 @@
         <w:rPr>
           <w:b/>
         </w:rPr>
-        <w:t>12.2. Efectos.</w:t>
+        <w:t>11.2. Efectos.</w:t>
       </w:r>
     </w:p>
     <w:p>
@@ -979,7 +877,7 @@
         <w:rPr>
           <w:b/>
         </w:rPr>
-        <w:t>12.3. Suspensión.</w:t>
+        <w:t>11.3. Suspensión.</w:t>
       </w:r>
     </w:p>
     <w:p>
@@ -1019,7 +917,7 @@
         <w:rPr>
           <w:b/>
         </w:rPr>
-        <w:t>CLÁUSULA DÉCIMO TERCERA: RESCISIÓN Y RESOLUCIÓN CONTRACTUAL</w:t>
+        <w:t>CLÁUSULA DÉCIMO SEGUNDA: RESCISIÓN Y RESOLUCIÓN CONTRACTUAL</w:t>
       </w:r>
     </w:p>
     <w:p>
@@ -1027,12 +925,12 @@
         <w:rPr>
           <w:b/>
         </w:rPr>
-        <w:t>13.1. Renuncia a la compensación por rescisión unilateral sin causa.</w:t>
+        <w:t>12.1. Renuncia a la compensación por rescisión unilateral sin causa.</w:t>
       </w:r>
     </w:p>
     <w:p>
       <w:r>
-        <w:t>LAS PARTES renuncian expresamente a la facultad de ser compensadas al rescindir unilateralmente el presente contrato sin que medie justa causa. EL CONTRATANTE reconoce que los servicios de consultoría y el acceso a la propiedad intelectual de LA EMPRESA se brindan de forma integral desde el inicio, por lo que la interrupción voluntaria por parte de EL CONTRATANTE no lo exime de abonar la totalidad de los honorarios pactados en la CLÁUSULA TERCERA, ni lo legitima a ser beneficiario de compensación alguna. La SEGUNDA CUOTA, por su naturaleza condicional, solo será exigible en los términos de la CLÁUSULA CUARTA, salvo que la no verificación de la condición obedezca a un incumplimiento de los deberes de implementación de EL CONTRATANTE conforme el apartado 4.3.</w:t>
+        <w:t>LAS PARTES renuncian expresamente a la facultad de ser compensadas al rescindir unilateralmente el presente contrato sin que medie justa causa. EL CONTRATANTE reconoce que los servicios de consultoría y el acceso a la propiedad intelectual de LA EMPRESA se brindan de forma integral desde el inicio, por lo que la interrupción voluntaria por parte de EL CONTRATANTE no lo exime de abonar la totalidad de los honorarios pactados en la CLÁUSULA TERCERA, ni lo legitima a ser beneficiario de compensación alguna.</w:t>
       </w:r>
     </w:p>
     <w:p>
@@ -1040,7 +938,7 @@
         <w:rPr>
           <w:b/>
         </w:rPr>
-        <w:t>13.2. Resolución por incumplimiento.</w:t>
+        <w:t>12.2. Resolución por incumplimiento.</w:t>
       </w:r>
     </w:p>
     <w:p>
@@ -1058,7 +956,7 @@
         <w:pStyle w:val="ListBullet"/>
       </w:pPr>
       <w:r>
-        <w:t>Por parte de EL CONTRATANTE: la mora en el pago por más de 10 (DIEZ) días hábiles; la violación de las normas de propiedad intelectual o confidencialidad; el incumplimiento reiterado de los deberes de colaboración, respuesta y provisión de información previstos en las CLÁUSULAS SEGUNDA y NOVENA; y el incumplimiento de los deberes de implementación previstos en el apartado 4.3.</w:t>
+        <w:t>Por parte de EL CONTRATANTE: la mora en el pago por más de 10 (DIEZ) días hábiles; la violación de las normas de propiedad intelectual o confidencialidad; y el incumplimiento reiterado de los deberes de colaboración, respuesta y provisión de información previstos en las CLÁUSULAS SEGUNDA y OCTAVA.</w:t>
       </w:r>
     </w:p>
     <w:p>
@@ -1066,12 +964,12 @@
         <w:pStyle w:val="ListBullet"/>
       </w:pPr>
       <w:r>
-        <w:t>Por parte de LA EMPRESA: la falta de prestación de los servicios detallados en el Anexo I sin causa justificada por más de 10 (DIEZ) días hábiles; la violación grave de las obligaciones de confidencialidad establecidas en la CLÁUSULA DÉCIMA; el uso indebido de la información, materiales o documentación que EL CONTRATANTE le hubiera proporcionado en el marco de la ejecución del contrato; y el incumplimiento reiterado del procedimiento de restitución y eliminación de información previsto en el apartado 13.4.</w:t>
+        <w:t>Por parte de LA EMPRESA: la falta de prestación de los servicios detallados en el Anexo I sin causa justificada por más de 10 (DIEZ) días hábiles; la violación grave de las obligaciones de confidencialidad establecidas en la CLÁUSULA NOVENA; el uso indebido de la información, materiales o documentación que EL CONTRATANTE le hubiera proporcionado en el marco de la ejecución del contrato; y el incumplimiento reiterado del procedimiento de restitución y eliminación de información previsto en el apartado 12.4.</w:t>
       </w:r>
     </w:p>
     <w:p>
       <w:r>
-        <w:t>(b) Procedimiento de subsanación: la parte cumplidora deberá intimar a la incumplidora mediante notificación fehaciente conforme a lo dispuesto en la CLÁUSULA DÉCIMO SEXTA para que subsane el incumplimiento en un plazo de 10 (DIEZ) días hábiles. Si vencido el plazo la falta persiste, el contrato se resolverá de pleno derecho.</w:t>
+        <w:t>(b) Procedimiento de subsanación: la parte cumplidora deberá intimar a la incumplidora mediante notificación fehaciente conforme a lo dispuesto en la CLÁUSULA DÉCIMO QUINTA para que subsane el incumplimiento en un plazo de 10 (DIEZ) días hábiles. Si vencido el plazo la falta persiste, el contrato se resolverá de pleno derecho.</w:t>
       </w:r>
     </w:p>
     <w:p>
@@ -1084,7 +982,7 @@
         <w:rPr>
           <w:b/>
         </w:rPr>
-        <w:t>13.3. Supervivencia de cláusulas.</w:t>
+        <w:t>12.3. Supervivencia de cláusulas.</w:t>
       </w:r>
     </w:p>
     <w:p>
@@ -1097,7 +995,7 @@
         <w:pStyle w:val="ListBullet"/>
       </w:pPr>
       <w:r>
-        <w:t>Propiedad intelectual y titularidad sobre los contenidos generados durante la prestación (CLÁUSULA DÉCIMA).</w:t>
+        <w:t>Propiedad intelectual y titularidad sobre los contenidos generados durante la prestación (CLÁUSULA NOVENA).</w:t>
       </w:r>
     </w:p>
     <w:p>
@@ -1105,7 +1003,7 @@
         <w:pStyle w:val="ListBullet"/>
       </w:pPr>
       <w:r>
-        <w:t>Confidencialidad y sus excepciones, por el plazo allí establecido (CLÁUSULA DÉCIMA).</w:t>
+        <w:t>Confidencialidad y sus excepciones, por el plazo allí establecido (CLÁUSULA NOVENA).</w:t>
       </w:r>
     </w:p>
     <w:p>
@@ -1113,7 +1011,7 @@
         <w:pStyle w:val="ListBullet"/>
       </w:pPr>
       <w:r>
-        <w:t>Indemnidad y limitación de responsabilidad (CLÁUSULA DÉCIMO PRIMERA).</w:t>
+        <w:t>Indemnidad y limitación de responsabilidad (CLÁUSULA DÉCIMA).</w:t>
       </w:r>
     </w:p>
     <w:p>
@@ -1121,7 +1019,7 @@
         <w:pStyle w:val="ListBullet"/>
       </w:pPr>
       <w:r>
-        <w:t>Restitución y eliminación de información (apartado 13.4).</w:t>
+        <w:t>Restitución y eliminación de información (apartado 12.4).</w:t>
       </w:r>
     </w:p>
     <w:p>
@@ -1137,7 +1035,7 @@
         <w:pStyle w:val="ListBullet"/>
       </w:pPr>
       <w:r>
-        <w:t>Jurisdicción, derecho aplicable y mecanismos de resolución de controversias (CLÁUSULA DÉCIMO SÉPTIMA).</w:t>
+        <w:t>Jurisdicción, derecho aplicable y mecanismos de resolución de controversias (CLÁUSULA DÉCIMO SEXTA).</w:t>
       </w:r>
     </w:p>
     <w:p>
@@ -1153,7 +1051,7 @@
         <w:rPr>
           <w:b/>
         </w:rPr>
-        <w:t>13.4. Restitución y eliminación de información al término del contrato.</w:t>
+        <w:t>12.4. Restitución y eliminación de información al término del contrato.</w:t>
       </w:r>
     </w:p>
     <w:p>
@@ -1163,7 +1061,7 @@
     </w:p>
     <w:p>
       <w:r>
-        <w:t>(b) Excepciones por obligación legal: no obstante lo anterior, cada parte podrá conservar aquellas copias de la Información Confidencial cuya retención sea estrictamente necesaria para el cumplimiento de obligaciones legales, fiscales, contables o regulatorias, o para la defensa de sus derechos en sede judicial o administrativa. La información así retenida permanecerá sujeta a las obligaciones de confidencialidad establecidas en la CLÁUSULA DÉCIMA por todo el tiempo en que subsista dicha retención.</w:t>
+        <w:t>(b) Excepciones por obligación legal: no obstante lo anterior, cada parte podrá conservar aquellas copias de la Información Confidencial cuya retención sea estrictamente necesaria para el cumplimiento de obligaciones legales, fiscales, contables o regulatorias, o para la defensa de sus derechos en sede judicial o administrativa. La información así retenida permanecerá sujeta a las obligaciones de confidencialidad establecidas en la CLÁUSULA NOVENA por todo el tiempo en que subsista dicha retención.</w:t>
       </w:r>
     </w:p>
     <w:p>
@@ -1174,7 +1072,7 @@
         <w:rPr>
           <w:b/>
         </w:rPr>
-        <w:t>CLÁUSULA DÉCIMO CUARTA: NATURALEZA DE LA RELACIÓN</w:t>
+        <w:t>CLÁUSULA DÉCIMO TERCERA: NATURALEZA DE LA RELACIÓN</w:t>
       </w:r>
     </w:p>
     <w:p>
@@ -1182,7 +1080,7 @@
         <w:rPr>
           <w:b/>
         </w:rPr>
-        <w:t>14.1. Independencia de las partes.</w:t>
+        <w:t>13.1. Independencia de las partes.</w:t>
       </w:r>
     </w:p>
     <w:p>
@@ -1195,7 +1093,7 @@
         <w:rPr>
           <w:b/>
         </w:rPr>
-        <w:t>14.2. Ausencia de subordinación.</w:t>
+        <w:t>13.2. Ausencia de subordinación.</w:t>
       </w:r>
     </w:p>
     <w:p>
@@ -1208,7 +1106,7 @@
         <w:rPr>
           <w:b/>
         </w:rPr>
-        <w:t>14.3. Personal afectado.</w:t>
+        <w:t>13.3. Personal afectado.</w:t>
       </w:r>
     </w:p>
     <w:p>
@@ -1224,7 +1122,7 @@
         <w:rPr>
           <w:b/>
         </w:rPr>
-        <w:t>CLÁUSULA DÉCIMO QUINTA: SUBCONTRATACIÓN</w:t>
+        <w:t>CLÁUSULA DÉCIMO CUARTA: SUBCONTRATACIÓN</w:t>
       </w:r>
     </w:p>
     <w:p>
@@ -1232,7 +1130,7 @@
         <w:rPr>
           <w:b/>
         </w:rPr>
-        <w:t>15.1. Facultad de subcontratar.</w:t>
+        <w:t>14.1. Facultad de subcontratar.</w:t>
       </w:r>
     </w:p>
     <w:p>
@@ -1245,7 +1143,7 @@
         <w:rPr>
           <w:b/>
         </w:rPr>
-        <w:t>15.2. Responsabilidad de LA EMPRESA.</w:t>
+        <w:t>14.2. Responsabilidad de LA EMPRESA.</w:t>
       </w:r>
     </w:p>
     <w:p>
@@ -1258,12 +1156,12 @@
         <w:rPr>
           <w:b/>
         </w:rPr>
-        <w:t>15.3. Extensión de obligaciones a subcontratistas.</w:t>
+        <w:t>14.3. Extensión de obligaciones a subcontratistas.</w:t>
       </w:r>
     </w:p>
     <w:p>
       <w:r>
-        <w:t>LA EMPRESA garantiza que todo subcontratista que afecte a la prestación del servicio se encontrará vinculado por obligaciones de confidencialidad y propiedad intelectual de alcance equivalente a las establecidas en la CLÁUSULA DÉCIMA, debiendo instrumentarse por escrito con anterioridad al acceso del subcontratista a cualquier información de EL CONTRATANTE. El incumplimiento de esta obligación por parte de un subcontratista será considerado incumplimiento directo de LA EMPRESA frente a EL CONTRATANTE.</w:t>
+        <w:t>LA EMPRESA garantiza que todo subcontratista que afecte a la prestación del servicio se encontrará vinculado por obligaciones de confidencialidad y propiedad intelectual de alcance equivalente a las establecidas en la CLÁUSULA NOVENA, debiendo instrumentarse por escrito con anterioridad al acceso del subcontratista a cualquier información de EL CONTRATANTE. El incumplimiento de esta obligación por parte de un subcontratista será considerado incumplimiento directo de LA EMPRESA frente a EL CONTRATANTE.</w:t>
       </w:r>
     </w:p>
     <w:p>
@@ -1274,7 +1172,7 @@
         <w:rPr>
           <w:b/>
         </w:rPr>
-        <w:t>CLÁUSULA DÉCIMO SEXTA: CANALES DE COMUNICACIÓN Y CAMBIOS EN EL DOMICILIO</w:t>
+        <w:t>CLÁUSULA DÉCIMO QUINTA: CANALES DE COMUNICACIÓN Y CAMBIOS EN EL DOMICILIO</w:t>
       </w:r>
     </w:p>
     <w:p>
@@ -1282,7 +1180,7 @@
         <w:rPr>
           <w:b/>
         </w:rPr>
-        <w:t>16.1. Domicilios constituidos.</w:t>
+        <w:t>15.1. Domicilios constituidos.</w:t>
       </w:r>
     </w:p>
     <w:p>
@@ -1295,7 +1193,7 @@
         <w:rPr>
           <w:b/>
         </w:rPr>
-        <w:t>16.2. Canal de comunicación.</w:t>
+        <w:t>15.2. Canal de comunicación.</w:t>
       </w:r>
     </w:p>
     <w:p>
@@ -1318,7 +1216,7 @@
         <w:rPr>
           <w:b/>
         </w:rPr>
-        <w:t>16.3. Cambio de domicilio y/o correo electrónico.</w:t>
+        <w:t>15.3. Cambio de domicilio y/o correo electrónico.</w:t>
       </w:r>
     </w:p>
     <w:p>
@@ -1334,7 +1232,7 @@
         <w:rPr>
           <w:b/>
         </w:rPr>
-        <w:t>CLÁUSULA DÉCIMO SÉPTIMA: JURISDICCIÓN Y DERECHO APLICABLE</w:t>
+        <w:t>CLÁUSULA DÉCIMO SEXTA: JURISDICCIÓN Y DERECHO APLICABLE</w:t>
       </w:r>
     </w:p>
     <w:p>
@@ -1342,7 +1240,7 @@
         <w:rPr>
           <w:b/>
         </w:rPr>
-        <w:t>17.1. Compromiso de solución amistosa.</w:t>
+        <w:t>16.1. Compromiso de solución amistosa.</w:t>
       </w:r>
     </w:p>
     <w:p>
@@ -1355,7 +1253,7 @@
         <w:rPr>
           <w:b/>
         </w:rPr>
-        <w:t>17.2. Jurisdicción internacional directa.</w:t>
+        <w:t>16.2. Jurisdicción internacional directa.</w:t>
       </w:r>
     </w:p>
     <w:p>
@@ -1368,7 +1266,7 @@
         <w:rPr>
           <w:b/>
         </w:rPr>
-        <w:t>17.3. Derecho aplicable.</w:t>
+        <w:t>16.3. Derecho aplicable.</w:t>
       </w:r>
     </w:p>
     <w:p>
@@ -1381,7 +1279,7 @@
         <w:rPr>
           <w:b/>
         </w:rPr>
-        <w:t>17.4. Renuncia a flexibilización.</w:t>
+        <w:t>16.4. Renuncia a flexibilización.</w:t>
       </w:r>
     </w:p>
     <w:p>
@@ -1394,7 +1292,7 @@
         <w:rPr>
           <w:b/>
         </w:rPr>
-        <w:t>17.5. Divisibilidad.</w:t>
+        <w:t>16.5. Divisibilidad.</w:t>
       </w:r>
     </w:p>
     <w:p>
@@ -1407,7 +1305,7 @@
         <w:rPr>
           <w:b/>
         </w:rPr>
-        <w:t>17.6. Validez de la firma digital.</w:t>
+        <w:t>16.6. Validez de la firma digital.</w:t>
       </w:r>
     </w:p>
     <w:p>
@@ -1423,7 +1321,7 @@
         <w:rPr>
           <w:b/>
         </w:rPr>
-        <w:t>CLÁUSULA DÉCIMO OCTAVA: INTEGRIDAD DEL ACUERDO Y MODIFICACIONES</w:t>
+        <w:t>CLÁUSULA DÉCIMO SÉPTIMA: INTEGRIDAD DEL ACUERDO Y MODIFICACIONES</w:t>
       </w:r>
     </w:p>
     <w:p>
@@ -1431,7 +1329,7 @@
         <w:rPr>
           <w:b/>
         </w:rPr>
-        <w:t>18.1. Integridad del acuerdo.</w:t>
+        <w:t>17.1. Integridad del acuerdo.</w:t>
       </w:r>
     </w:p>
     <w:p>
@@ -1444,20 +1342,7 @@
         <w:rPr>
           <w:b/>
         </w:rPr>
-        <w:t>18.2. Registro de la negociación.</w:t>
-      </w:r>
-    </w:p>
-    <w:p>
-      <w:r>
-        <w:t>LAS PARTES reconocen que la reunión celebrada el {{FECHA_LLAMADA}}, registrada y disponible en el enlace {{LINK_LLAMADA}}, constituye antecedente documental de los términos negociados, conforme se detalla en el Anexo III. En caso de discrepancia entre dicha grabación y el presente contrato o sus anexos, prevalecerá lo establecido en estos últimos.</w:t>
-      </w:r>
-    </w:p>
-    <w:p>
-      <w:r>
-        <w:rPr>
-          <w:b/>
-        </w:rPr>
-        <w:t>18.3. Inexistencia de acuerdos paralelos.</w:t>
+        <w:t>17.2. Inexistencia de acuerdos paralelos.</w:t>
       </w:r>
     </w:p>
     <w:p>
@@ -1470,7 +1355,7 @@
         <w:rPr>
           <w:b/>
         </w:rPr>
-        <w:t>18.4. Modificaciones.</w:t>
+        <w:t>17.3. Modificaciones.</w:t>
       </w:r>
     </w:p>
     <w:p>
@@ -1534,7 +1419,7 @@
     </w:p>
     <w:p>
       <w:r>
-        <w:t>El presente Anexo regula el alcance, los componentes y las condiciones operativas del Programa de Acompañamiento Personalizado (en adelante, el “Programa”), que LA EMPRESA prestará a EL CONTRATANTE durante la vigencia de TRES (3) meses establecida en la CLÁUSULA SEXTA del contrato principal. La prestación se rige por la CLÁUSULA SÉPTIMA del contrato principal.</w:t>
+        <w:t>El presente Anexo regula el alcance, los componentes y las condiciones operativas del Programa de Acompañamiento Personalizado (en adelante, el “Programa”), que LA EMPRESA prestará a EL CONTRATANTE durante la vigencia de TRES (3) meses establecida en la CLÁUSULA QUINTA del contrato principal. La prestación se rige por la CLÁUSULA SEXTA del contrato principal.</w:t>
       </w:r>
     </w:p>
     <w:p>
@@ -1657,7 +1542,7 @@
     </w:p>
     <w:p>
       <w:r>
-        <w:t>El Programa se prestará durante el plazo previsto en la CLÁUSULA SEXTA del contrato principal. Las prestaciones se ejecutarán por las siguientes modalidades, conforme corresponda a cada componente:</w:t>
+        <w:t>El Programa se prestará durante el plazo previsto en la CLÁUSULA QUINTA del contrato principal. Las prestaciones se ejecutarán por las siguientes modalidades, conforme corresponda a cada componente:</w:t>
       </w:r>
     </w:p>
     <w:p>
@@ -1681,157 +1566,11 @@
         <w:pStyle w:val="ListBullet"/>
       </w:pPr>
       <w:r>
-        <w:t>Modalidad escrita asincrónica: feedback por correo electrónico o por el canal que LA EMPRESA designe. Todo seguimiento, acompañamiento o soporte previsto en el presente Anexo se prestará dentro del plazo de vigencia del Programa y concluirá con su terminación, sin perjuicio de lo dispuesto en el apartado 4.5 del contrato principal.</w:t>
-      </w:r>
-    </w:p>
-    <w:p>
-      <w:r>
-        <w:br w:type="page"/>
-      </w:r>
-    </w:p>
-    <w:p>
-      <w:pPr>
-        <w:jc w:val="center"/>
-      </w:pPr>
-      <w:r>
-        <w:rPr>
-          <w:b/>
-          <w:sz w:val="26"/>
-        </w:rPr>
-        <w:t>ANEXO II — MÉTRICA Y VERIFICACIÓN DE LA CONDICIÓN DE RESULTADOS</w:t>
+        <w:t>Modalidad escrita asincrónica: feedback por correo electrónico o por el canal que LA EMPRESA designe. Todo seguimiento, acompañamiento o soporte previsto en el presente Anexo se prestará dentro del plazo de vigencia del Programa y concluirá con su terminación.</w:t>
       </w:r>
     </w:p>
     <w:p/>
-    <w:p>
-      <w:r>
-        <w:t>El presente Anexo desarrolla la condición prevista en la CLÁUSULA CUARTA del contrato principal y forma parte integrante e indivisible del mismo.</w:t>
-      </w:r>
-    </w:p>
-    <w:p>
-      <w:r>
-        <w:rPr>
-          <w:b/>
-        </w:rPr>
-        <w:t>1. LÍNEA BASE DECLARADA</w:t>
-      </w:r>
-    </w:p>
-    <w:p>
-      <w:r>
-        <w:t>EL CONTRATANTE declara que, a la fecha de firma del presente, percibe ingresos mensuales provenientes de sus clientes por un monto estimado de {{INGRESOS_ACTUALES}}. La presente declaración constituye la línea base de medición de la condición de resultados.</w:t>
-      </w:r>
-    </w:p>
-    <w:p>
-      <w:r>
-        <w:rPr>
-          <w:b/>
-        </w:rPr>
-        <w:t>2. CONDICIÓN DE RESULTADOS</w:t>
-      </w:r>
-    </w:p>
-    <w:p>
-      <w:r>
-        <w:t>La condición prevista en la CLÁUSULA CUARTA se entenderá verificada cuando, dentro de los primeros TREINTA (30) días corridos contados desde la fecha del primer pago, EL CONTRATANTE acredite un incremento de al menos USD 500 (QUINIENTOS) DÓLARES ESTADOUNIDENSES en sus ingresos mensuales percibidos de los clientes con los cuales aplica el Programa, alcanzando ingresos mensuales verificados de al menos {{META_INGRESOS}}.</w:t>
-      </w:r>
-    </w:p>
-    <w:p>
-      <w:r>
-        <w:rPr>
-          <w:b/>
-        </w:rPr>
-        <w:t>3. FUENTES DE VERIFICACIÓN</w:t>
-      </w:r>
-    </w:p>
-    <w:p>
-      <w:r>
-        <w:t>La verificación se realizará sobre la documentación objetiva que EL CONTRATANTE provea, incluyendo, sin limitación:</w:t>
-      </w:r>
-    </w:p>
-    <w:p>
-      <w:pPr>
-        <w:pStyle w:val="ListBullet"/>
-      </w:pPr>
-      <w:r>
-        <w:t>Registros de su CRM y de su plataforma de mensajería (incluyendo, sin limitación, Manychat).</w:t>
-      </w:r>
-    </w:p>
-    <w:p>
-      <w:pPr>
-        <w:pStyle w:val="ListBullet"/>
-      </w:pPr>
-      <w:r>
-        <w:t>Extractos, comprobantes o capturas de plataformas de cobro y procesamiento de pagos de sus clientes.</w:t>
-      </w:r>
-    </w:p>
-    <w:p>
-      <w:pPr>
-        <w:pStyle w:val="ListBullet"/>
-      </w:pPr>
-      <w:r>
-        <w:t>Comprobantes de comisiones o pagos percibidos, incluyendo registros de la plataforma Binance.</w:t>
-      </w:r>
-    </w:p>
-    <w:p>
-      <w:pPr>
-        <w:pStyle w:val="ListBullet"/>
-      </w:pPr>
-      <w:r>
-        <w:t>Cualquier otra documentación comercial razonable que LA EMPRESA requiera conforme la CLÁUSULA NOVENA del contrato principal.</w:t>
-      </w:r>
-    </w:p>
-    <w:p>
-      <w:r>
-        <w:rPr>
-          <w:b/>
-        </w:rPr>
-        <w:t>4. PROCEDIMIENTO DE VERIFICACIÓN</w:t>
-      </w:r>
-    </w:p>
-    <w:p>
-      <w:r>
-        <w:t>A más tardar dentro de los TREINTA (30) días corridos contados desde la fecha del primer pago, EL CONTRATANTE entregará a LA EMPRESA un reporte escrito de sus ingresos del período, acompañado de las fuentes de verificación previstas en el punto 3. LA EMPRESA contará con un plazo de CINCO (5) días hábiles para revisar la documentación y ejercer su facultad de auditoría conforme la CLÁUSULA NOVENA. Ante desacuerdo sobre la medición, LAS PARTES resolverán de buena fe sobre la base de la documentación objetiva disponible.</w:t>
-      </w:r>
-    </w:p>
-    <w:p>
-      <w:r>
-        <w:rPr>
-          <w:b/>
-        </w:rPr>
-        <w:t>5. IMPLEMENTACIÓN PREVIA REQUERIDA</w:t>
-      </w:r>
-    </w:p>
-    <w:p>
-      <w:r>
-        <w:t>La condición solo opera si EL CONTRATANTE ha cumplido, a la fecha de verificación, con los deberes de implementación previstos en el apartado 4.3 del contrato principal: asistencia a las tres (3) sesiones individuales o su reprogramación conforme la CLÁUSULA OCTAVA, y ejecución de las acciones del roadmap personalizado. El incumplimiento de dichos deberes tiene el efecto previsto en el apartado 4.3 del contrato principal.</w:t>
-      </w:r>
-    </w:p>
-    <w:p>
-      <w:r>
-        <w:br w:type="page"/>
-      </w:r>
-    </w:p>
-    <w:p>
-      <w:pPr>
-        <w:jc w:val="center"/>
-      </w:pPr>
-      <w:r>
-        <w:rPr>
-          <w:b/>
-          <w:sz w:val="26"/>
-        </w:rPr>
-        <w:t>ANEXO III — REGISTRO DE LA NEGOCIACIÓN</w:t>
-      </w:r>
-    </w:p>
     <w:p/>
-    <w:p>
-      <w:r>
-        <w:t>LAS PARTES reconocen que los términos del presente contrato, incluyendo la estructura de pagos en tres cuotas, el recargo por financiación, la condición de resultados vinculada a la segunda cuota, la duración de TRES (3) meses del Programa, los componentes incluidos y excluidos, y el mecanismo de crédito hacia el programa “ENTRY LEVEL”, fueron negociados y acordados en la reunión celebrada el {{FECHA_LLAMADA}} entre las partes, la cual quedó registrada y se encuentra disponible en el enlace {{LINK_LLAMADA}}.</w:t>
-      </w:r>
-    </w:p>
-    <w:p>
-      <w:r>
-        <w:t>Dicha grabación se incorpora al presente como antecedente documental de la negociación. En caso de discrepancia entre la grabación y el presente contrato o sus anexos, prevalecerá lo establecido en estos últimos, conforme la CLÁUSULA DÉCIMO OCTAVA del contrato principal.</w:t>
-      </w:r>
-    </w:p>
     <w:sectPr>
       <w:pgSz w:w="12240" w:h="15840"/>
       <w:pgMar w:top="1440" w:right="1800" w:bottom="1440" w:left="1800" w:header="720" w:footer="720" w:gutter="0"/>

</xml_diff>

<commit_message>
Contrato 2K: el canal privado sirve solo para coordinar las sesiones 1 a 1 (1.2 a y Anexo I.4)
Lo que queda excluido es la atención de consultas por chat. Plantilla nueva en ZapSign:
ZAPSIGN_TEMPLATE_2K=981fb0db-… (la a4074080 se borró).

Co-Authored-By: Claude Opus 5.5 <noreply@anthropic.com>
</commit_message>
<xml_diff>
--- a/contratos/Contrato 2K ATV.docx
+++ b/contratos/Contrato 2K ATV.docx
@@ -54,7 +54,7 @@
     </w:p>
     <w:p>
       <w:r>
-        <w:t>Quedan expresamente EXCLUIDOS del presente Programa: (a) el chat uno a uno mediante Discord o plataforma análoga; (b) las clases en vivo, sean estas grupales o individuales, distintas de las tres (3) sesiones individuales previstas en el Anexo I; y (c) todo otro componente perteneciente al programa “ENTRY LEVEL” de LA EMPRESA. Dichos componentes únicamente se habilitarán mediante la contratación del programa “ENTRY LEVEL”, conforme el mecanismo de crédito previsto en el punto 5 del Anexo I.</w:t>
+        <w:t>Quedan expresamente EXCLUIDOS del presente Programa: (a) la atención de consultas por chat uno a uno mediante Discord o plataforma análoga. El canal privado de EL CONTRATANTE en la plataforma de LA EMPRESA se utilizará únicamente para coordinar las sesiones individuales previstas en el Anexo I; (b) las clases en vivo, sean estas grupales o individuales, distintas de las tres (3) sesiones individuales previstas en el Anexo I; y (c) todo otro componente perteneciente al programa “ENTRY LEVEL” de LA EMPRESA. Dichos componentes únicamente se habilitarán mediante la contratación del programa “ENTRY LEVEL”, conforme el mecanismo de crédito previsto en el punto 5 del Anexo I.</w:t>
       </w:r>
     </w:p>
     <w:p>
@@ -1503,7 +1503,7 @@
     </w:p>
     <w:p>
       <w:r>
-        <w:t>Quedan expresamente excluidos del presente Programa, conforme la CLÁUSULA PRIMERA del contrato principal: (a) el chat uno a uno mediante Discord o plataforma análoga; (b) las clases en vivo, sean estas grupales o individuales, distintas de las tres (3) sesiones individuales previstas en el punto 2; y (c) todo otro componente perteneciente al programa “ENTRY LEVEL” de LA EMPRESA.</w:t>
+        <w:t>Quedan expresamente excluidos del presente Programa, conforme la CLÁUSULA PRIMERA del contrato principal: (a) la atención de consultas por chat uno a uno mediante Discord o plataforma análoga. El canal privado de EL CONTRATANTE en la plataforma de LA EMPRESA se utilizará únicamente para coordinar las sesiones individuales previstas en el punto 2; (b) las clases en vivo, sean estas grupales o individuales, distintas de las tres (3) sesiones individuales previstas en el punto 2; y (c) todo otro componente perteneciente al programa “ENTRY LEVEL” de LA EMPRESA.</w:t>
       </w:r>
     </w:p>
     <w:p>

</xml_diff>

<commit_message>
Contrato 2K: cuotas de USD 500, 650 y 1.150 (antes 500, 500 y 1.300)
Co-Authored-By: Claude Opus 5.5 <noreply@anthropic.com>
</commit_message>
<xml_diff>
--- a/contratos/Contrato 2K ATV.docx
+++ b/contratos/Contrato 2K ATV.docx
@@ -184,12 +184,12 @@
     </w:p>
     <w:p>
       <w:r>
-        <w:t>(b) SEGUNDA CUOTA: USD 500 (QUINIENTOS DÓLARES ESTADOUNIDENSES), exigible el {{FECHA_CUOTA_2}}.</w:t>
+        <w:t>(b) SEGUNDA CUOTA: USD 650 (SEISCIENTOS CINCUENTA DÓLARES ESTADOUNIDENSES), exigible el {{FECHA_CUOTA_2}}.</w:t>
       </w:r>
     </w:p>
     <w:p>
       <w:r>
-        <w:t>(c) TERCERA CUOTA: USD 1.300 (MIL TRESCIENTOS DÓLARES ESTADOUNIDENSES), exigible el {{FECHA_CUOTA_3}}.</w:t>
+        <w:t>(c) TERCERA CUOTA: USD 1.150 (MIL CIENTO CINCUENTA DÓLARES ESTADOUNIDENSES), exigible el {{FECHA_CUOTA_3}}.</w:t>
       </w:r>
     </w:p>
     <w:p>

</xml_diff>

<commit_message>
Contrato 2K: por ahora es el contrato final de Máximo Maydana (fases, salida a 30 días, 500/500/1.300 con sus fechas); el script de ZapSign sube solo lo pedido y arma el formulario con las variables que tiene el documento
Co-Authored-By: Claude Opus 5.5 <noreply@anthropic.com>
</commit_message>
<xml_diff>
--- a/contratos/Contrato 2K ATV.docx
+++ b/contratos/Contrato 2K ATV.docx
@@ -41,7 +41,7 @@
     </w:p>
     <w:p>
       <w:r>
-        <w:t>Por medio del presente contrato, LA EMPRESA se obliga a prestar a EL CONTRATANTE servicios profesionales de consultoría bajo el programa denominado “PROGRAMA DE ACOMPAÑAMIENTO PERSONALIZADO” (en adelante, el “Programa”), con una duración de TRES (3) meses, comprensivo de: (i) tres (3) sesiones individuales uno a uno a ejecutarse dentro de los primeros TREINTA (30) días corridos contados desde la fecha del primer pago, conforme el detalle del Anexo I; (ii) acceso a los materiales formativos, procesos documentados, sistemas, plantillas y recursos que LA EMPRESA designe conforme el diagnóstico realizado; y (iii) revisión y devolución de feedback, por escrito o en formato video, sobre las implementaciones que EL CONTRATANTE realice durante la vigencia del Programa. El alcance específico, los entregables y la modalidad de ejecución se detallan en el Anexo I — Alcance y Condiciones del Servicio (en adelante, “Anexo I”), que forma parte integrante e indivisible del presente.</w:t>
+        <w:t>Por medio del presente contrato, LA EMPRESA se obliga a prestar a EL CONTRATANTE servicios profesionales de consultoría bajo el programa denominado “PROGRAMA DE ACOMPAÑAMIENTO PERSONALIZADO” (en adelante, el “Programa”), con una duración de TRES (3) meses, estructurado en dos (2) fases conforme la CLÁUSULA CUARTA, comprensivo de: (i) una (1) sesión individual de roadmap inicial a ejecutarse dentro de los primeros TREINTA (30) días corridos contados desde la fecha del primer pago; (ii) acceso a la plataforma de LA EMPRESA con los materiales formativos, procesos documentados, sistemas, plantillas y recursos que LA EMPRESA designe conforme el diagnóstico realizado; (iii) acompañamiento mediante grupo de WhatsApp y canal directo de comunicación durante toda la vigencia del Programa; y (iv) dos (2) sesiones individuales adicionales (marketing y electiva), que se habilitan únicamente a partir del ingreso efectivo de la SEGUNDA CUOTA, conforme el detalle del Anexo I. El alcance específico, los entregables y la modalidad de ejecución se detallan en el Anexo I — Alcance y Condiciones del Servicio (en adelante, “Anexo I”), que forma parte integrante e indivisible del presente.</w:t>
       </w:r>
     </w:p>
     <w:p>
@@ -54,7 +54,7 @@
     </w:p>
     <w:p>
       <w:r>
-        <w:t>Quedan expresamente EXCLUIDOS del presente Programa: (a) la atención de consultas por chat uno a uno mediante Discord o plataforma análoga. El canal privado de EL CONTRATANTE en la plataforma de LA EMPRESA se utilizará únicamente para coordinar las sesiones individuales previstas en el Anexo I; (b) las clases en vivo, sean estas grupales o individuales, distintas de las tres (3) sesiones individuales previstas en el Anexo I; y (c) todo otro componente perteneciente al programa “ENTRY LEVEL” de LA EMPRESA. Dichos componentes únicamente se habilitarán mediante la contratación del programa “ENTRY LEVEL”, conforme el mecanismo de crédito previsto en el punto 5 del Anexo I.</w:t>
+        <w:t>Quedan expresamente EXCLUIDOS del presente Programa: (a) el chat uno a uno mediante Discord o plataforma análoga; (b) las clases en vivo, sean estas grupales o individuales, distintas de las sesiones individuales previstas en el Anexo I; y (c) todo otro componente perteneciente al programa “ENTRY LEVEL” de LA EMPRESA. Dichos componentes únicamente se habilitarán mediante la contratación del programa “ENTRY LEVEL”, conforme el mecanismo de crédito previsto en el punto 6 del Anexo I.</w:t>
       </w:r>
     </w:p>
     <w:p>
@@ -122,7 +122,7 @@
     </w:p>
     <w:p>
       <w:r>
-        <w:t>(a) Pago de honorarios: abonar a LA EMPRESA la contraprestación económica total en los montos, plazos y formas establecidos en la CLÁUSULA TERCERA.</w:t>
+        <w:t>(a) Pago de honorarios: abonar a LA EMPRESA la contraprestación económica correspondiente en los montos, plazos y formas establecidos en las CLÁUSULAS TERCERA y CUARTA.</w:t>
       </w:r>
     </w:p>
     <w:p>
@@ -179,17 +179,17 @@
     </w:p>
     <w:p>
       <w:r>
-        <w:t>(a) PRIMERA CUOTA: USD 500 (QUINIENTOS DÓLARES ESTADOUNIDENSES), exigible a la firma del presente, abonada el {{FECHA_CUOTA_1}}, hecho que LAS PARTES reconocen expresamente.</w:t>
+        <w:t>(a) PRIMERA CUOTA: USD 500 (QUINIENTOS DÓLARES ESTADOUNIDENSES), exigible a la firma del presente contrato, abonada el 26 de octubre de 2026, hecho que LAS PARTES reconocen expresamente. Su ingreso efectivo habilita la FASE 1 prevista en la CLÁUSULA CUARTA y en el Anexo I.</w:t>
       </w:r>
     </w:p>
     <w:p>
       <w:r>
-        <w:t>(b) SEGUNDA CUOTA: USD 650 (SEISCIENTOS CINCUENTA DÓLARES ESTADOUNIDENSES), exigible el {{FECHA_CUOTA_2}}.</w:t>
+        <w:t>(b) SEGUNDA CUOTA: USD 500 (QUINIENTOS DÓLARES ESTADOUNIDENSES), exigible el 26 de noviembre de 2026. Su ingreso efectivo habilita la FASE 2 prevista en la CLÁUSULA CUARTA y en el Anexo I. Su exigibilidad está sujeta al derecho de salida voluntaria previsto en la CLÁUSULA CUARTA.</w:t>
       </w:r>
     </w:p>
     <w:p>
       <w:r>
-        <w:t>(c) TERCERA CUOTA: USD 1.150 (MIL CIENTO CINCUENTA DÓLARES ESTADOUNIDENSES), exigible el {{FECHA_CUOTA_3}}.</w:t>
+        <w:t>(c) TERCERA CUOTA: USD 1.300 (MIL TRESCIENTOS DÓLARES ESTADOUNIDENSES), exigible el 26 de diciembre de 2026, cuya función es completar el precio total del Programa y sostener el acompañamiento durante el tercer mes de vigencia. No habilita prestaciones adicionales a las previstas en el Anexo I.</w:t>
       </w:r>
     </w:p>
     <w:p>
@@ -202,7 +202,7 @@
     </w:p>
     <w:p>
       <w:r>
-        <w:t>El pago de los honorarios se efectúa mediante transferencia de criptomoneda USDT a través de la plataforma Binance, a la billetera virtual cuya identificación (Binance ID) informa LA EMPRESA a EL CONTRATANTE a través de los canales de comunicación designados. Cada pago deberá ser acompañado del comprobante de transferencia correspondiente.</w:t>
+        <w:t>El pago de los honorarios se efectúa mediante transferencia de criptomoneda USDT a través de la plataforma Binance, a la billetera virtual cuya identificación (Binance ID) informa LA EMPRESA a EL CONTRATANTE a través de los canales de comunicación designados, cuyos datos son: ________________________________. Cada pago deberá ser acompañado del comprobante de transferencia correspondiente.</w:t>
       </w:r>
     </w:p>
     <w:p>
@@ -215,7 +215,7 @@
     </w:p>
     <w:p>
       <w:r>
-        <w:t>Todo pago se considerará efectuado en la fecha en que los fondos ingresen efectivamente a la billetera virtual de LA EMPRESA. El acceso al servicio solo se habilita tras el ingreso efectivo de la cuota correspondiente. LA EMPRESA queda exonerada de toda responsabilidad por errores en el procesamiento, rechazos o cobros fallidos derivados de la falta de notificación oportuna. Los pagos fallidos por causas imputables a EL CONTRATANTE se considerarán incumplimiento en los términos de la CLÁUSULA DÉCIMO SEGUNDA.</w:t>
+        <w:t>Todo pago se considerará efectuado en la fecha en que los fondos ingresen efectivamente a la billetera virtual de LA EMPRESA. El acceso a cada fase del servicio solo se habilita tras el ingreso efectivo de la cuota correspondiente. LA EMPRESA queda exonerada de toda responsabilidad por errores en el procesamiento, rechazos o cobros fallidos derivados de la falta de notificación oportuna. Los pagos fallidos por causas imputables a EL CONTRATANTE se considerarán incumplimiento en los términos de la CLÁUSULA DÉCIMO TERCERA.</w:t>
       </w:r>
     </w:p>
     <w:p>
@@ -289,7 +289,7 @@
         <w:rPr>
           <w:b/>
         </w:rPr>
-        <w:t>CLÁUSULA CUARTA: ACEPTACIÓN DE LA RESPONSABILIDAD FINANCIERA</w:t>
+        <w:t>CLÁUSULA CUARTA: FASES DEL PROGRAMA, DESBLOQUEO DE SESIONES Y SALIDA VOLUNTARIA A LOS TREINTA (30) DÍAS</w:t>
       </w:r>
     </w:p>
     <w:p>
@@ -297,12 +297,74 @@
         <w:rPr>
           <w:b/>
         </w:rPr>
-        <w:t>4.1. Responsabilidad financiera.</w:t>
+        <w:t>4.1. Estructura por fases.</w:t>
       </w:r>
     </w:p>
     <w:p>
       <w:r>
-        <w:t>EL CONTRATANTE reconoce que la contratación de los servicios implica una responsabilidad financiera completa. La decisión de no utilizar total o parcialmente los servicios, o interrumpir su participación, no lo exime del cumplimiento de las obligaciones económicas asumidas en las CLÁUSULAS SEGUNDA y TERCERA, ni genera a su favor derecho a reembolso alguno.</w:t>
+        <w:t>El Programa se presta en dos (2) fases, conforme el siguiente esquema:</w:t>
+      </w:r>
+    </w:p>
+    <w:p>
+      <w:r>
+        <w:t>(a) FASE 1 — Primeros Treinta (30) días corridos contados desde la fecha del primer pago: EL CONTRATANTE tendrá (i) acceso a la plataforma de LA EMPRESA con los SOPs, procesos documentados, sistemas, plantillas y materiales que LA EMPRESA designe; (ii) acompañamiento mediante el grupo de WhatsApp designado por LA EMPRESA y canal directo de comunicación; y (iii) una (1) sesión individual de roadmap inicial con el integrante del equipo de LA EMPRESA designado al efecto, conforme el detalle del Anexo I.</w:t>
+      </w:r>
+    </w:p>
+    <w:p>
+      <w:r>
+        <w:t>(b) FASE 2 — Desbloqueo por pago: a partir del ingreso efectivo de la SEGUNDA CUOTA, se habilitan la sesión de marketing y la sesión electiva previstas en el Anexo I. El acompañamiento mediante grupo de WhatsApp y canal directo se mantiene durante toda la vigencia del Programa, en ambas fases.</w:t>
+      </w:r>
+    </w:p>
+    <w:p>
+      <w:r>
+        <w:rPr>
+          <w:b/>
+        </w:rPr>
+        <w:t>4.2. Salida voluntaria a los Treinta (30) días.</w:t>
+      </w:r>
+    </w:p>
+    <w:p>
+      <w:r>
+        <w:t>Hasta el vencimiento del plazo de la SEGUNDA CUOTA (26 de noviembre de 2026), EL CONTRATANTE podrá dar por terminado el presente contrato por su exclusiva voluntad, sin necesidad de invocar causa ni justificación alguna, mediante notificación cursada por correo electrónico conforme la CLÁUSULA DÉCIMO SEXTA. En tal supuesto, no será exigible el pago de la SEGUNDA CUOTA ni de la TERCERA CUOTA, y no se generará obligación de pago alguna distinta de la PRIMERA CUOTA ya abonada.</w:t>
+      </w:r>
+    </w:p>
+    <w:p>
+      <w:r>
+        <w:rPr>
+          <w:b/>
+        </w:rPr>
+        <w:t>4.3. Efectos de la salida voluntaria.</w:t>
+      </w:r>
+    </w:p>
+    <w:p>
+      <w:r>
+        <w:t>Ejercido el derecho previsto en el apartado 4.2: (a) el contrato quedará resuelto sin responsabilidad para ninguna de las partes; (b) LA EMPRESA no reembolsará la PRIMERA CUOTA, la cual se considera totalmente devengada en consideración a los accesos, materiales, acompañamiento y sesión de roadmap ya prestados; (c) EL CONTRATANTE conservará el acceso a la plataforma y a los materiales ya provistos, con carácter personal e intransferible conforme la CLÁUSULA DÉCIMA; (d) cesarán las sesiones restantes y el acompañamiento; y (e) subsistirán las cláusulas de supervivencia previstas en el apartado 13.3.</w:t>
+      </w:r>
+    </w:p>
+    <w:p>
+      <w:r>
+        <w:rPr>
+          <w:b/>
+        </w:rPr>
+        <w:t>4.4. Continuidad del Programa.</w:t>
+      </w:r>
+    </w:p>
+    <w:p>
+      <w:r>
+        <w:t>Si EL CONTRATANTE no ejerce la salida voluntaria dentro del plazo previsto en el apartado 4.2, la SEGUNDA CUOTA será exigible en su término y su ingreso efectivo habilitará la FASE 2. La falta de pago de la SEGUNDA CUOTA vencido su plazo, sin que medie ejercicio de la salida voluntaria, configurará mora conforme los apartados 3.3 y 13.2, con suspensión del acompañamiento y de las sesiones hasta la regularización integral del pago.</w:t>
+      </w:r>
+    </w:p>
+    <w:p>
+      <w:r>
+        <w:rPr>
+          <w:b/>
+        </w:rPr>
+        <w:t>4.5. Naturaleza del mecanismo.</w:t>
+      </w:r>
+    </w:p>
+    <w:p>
+      <w:r>
+        <w:t>LAS PARTES reconocen que la presente estructura de fases y el derecho de salida voluntaria constituyen un mecanismo comercial de alineación de incentivos y de reducción de la barrera de entrada, y no una garantía de resultados a favor de EL CONTRATANTE, sin perjuicio de lo dispuesto en la CLÁUSULA SÉPTIMA.</w:t>
       </w:r>
     </w:p>
     <w:p>
@@ -313,7 +375,7 @@
         <w:rPr>
           <w:b/>
         </w:rPr>
-        <w:t>CLÁUSULA QUINTA: PLAZO DE EJECUCIÓN Y VIGENCIA</w:t>
+        <w:t>CLÁUSULA QUINTA: ACEPTACIÓN DE LA RESPONSABILIDAD FINANCIERA</w:t>
       </w:r>
     </w:p>
     <w:p>
@@ -321,12 +383,12 @@
         <w:rPr>
           <w:b/>
         </w:rPr>
-        <w:t>5.1. Servicio principal.</w:t>
+        <w:t>5.1. Responsabilidad financiera.</w:t>
       </w:r>
     </w:p>
     <w:p>
       <w:r>
-        <w:t>Los servicios contratados bajo el presente contrato se prestarán por un plazo máximo de TRES (3) meses consecutivos, contados desde la fecha del primer pago o desde la firma del contrato, lo que ocurra primero.</w:t>
+        <w:t>EL CONTRATANTE reconoce que la contratación de los servicios implica una responsabilidad financiera completa. La decisión de no utilizar total o parcialmente los servicios, o interrumpir su participación, no lo exime del cumplimiento de las obligaciones económicas asumidas en las CLÁUSULAS SEGUNDA y TERCERA, ni genera a su favor derecho a reembolso alguno, sin perjuicio del derecho de salida voluntaria previsto en la CLÁUSULA CUARTA, que constituye el único mecanismo de terminación anticipada sin pago de las cuotas restantes.</w:t>
       </w:r>
     </w:p>
     <w:p>
@@ -337,7 +399,7 @@
         <w:rPr>
           <w:b/>
         </w:rPr>
-        <w:t>CLÁUSULA SEXTA: NATURALEZA DE LAS OBLIGACIONES DE LA EMPRESA</w:t>
+        <w:t>CLÁUSULA SEXTA: PLAZO DE EJECUCIÓN Y VIGENCIA</w:t>
       </w:r>
     </w:p>
     <w:p>
@@ -345,7 +407,31 @@
         <w:rPr>
           <w:b/>
         </w:rPr>
-        <w:t>6.1. Obligación de medios.</w:t>
+        <w:t>6.1. Servicio principal.</w:t>
+      </w:r>
+    </w:p>
+    <w:p>
+      <w:r>
+        <w:t>Los servicios contratados bajo el presente contrato se prestarán por un plazo máximo de TRES (3) meses consecutivos, contados desde la fecha del primer pago o desde la firma del contrato, lo que ocurra primero. Lo dispuesto en el apartado 4.3 podrá anticipar la finalización del Programa.</w:t>
+      </w:r>
+    </w:p>
+    <w:p>
+      <w:pPr>
+        <w:spacing w:before="280"/>
+      </w:pPr>
+      <w:r>
+        <w:rPr>
+          <w:b/>
+        </w:rPr>
+        <w:t>CLÁUSULA SÉPTIMA: NATURALEZA DE LAS OBLIGACIONES DE LA EMPRESA</w:t>
+      </w:r>
+    </w:p>
+    <w:p>
+      <w:r>
+        <w:rPr>
+          <w:b/>
+        </w:rPr>
+        <w:t>7.1. Obligación de medios.</w:t>
       </w:r>
     </w:p>
     <w:p>
@@ -358,12 +444,12 @@
         <w:rPr>
           <w:b/>
         </w:rPr>
-        <w:t>6.2. Ausencia de garantías específicas.</w:t>
+        <w:t>7.2. Ausencia de garantías específicas.</w:t>
       </w:r>
     </w:p>
     <w:p>
       <w:r>
-        <w:t>LA EMPRESA no garantiza resultados financieros, laborales, comerciales o de éxito específicos, por lo que la no obtención de los mismos no podrá constituir incumplimiento por parte de LA EMPRESA. Todo testimonio o ejemplo compartido debe interpretarse como referencia y no como promesa de resultados futuros.</w:t>
+        <w:t>LA EMPRESA no garantiza resultados financieros, laborales, comerciales o de éxito específicos, por lo que la no obtención de los mismos no podrá constituir incumplimiento por parte de LA EMPRESA. Todo testimonio o ejemplo compartido debe interpretarse como referencia y no como promesa de resultados futuros. La estructura de fases y salida voluntaria prevista en la CLÁUSULA CUARTA es un mecanismo comercial de pago y no constituye garantía, promesa ni obligación de resultado.</w:t>
       </w:r>
     </w:p>
     <w:p>
@@ -374,7 +460,7 @@
         <w:rPr>
           <w:b/>
         </w:rPr>
-        <w:t>CLÁUSULA SÉPTIMA: CONDICIONES DE PARTICIPACIÓN</w:t>
+        <w:t>CLÁUSULA OCTAVA: CONDICIONES DE PARTICIPACIÓN</w:t>
       </w:r>
     </w:p>
     <w:p>
@@ -382,7 +468,7 @@
         <w:rPr>
           <w:b/>
         </w:rPr>
-        <w:t>7.1. Declaraciones del CONTRATANTE.</w:t>
+        <w:t>8.1. Declaraciones del CONTRATANTE.</w:t>
       </w:r>
     </w:p>
     <w:p>
@@ -395,7 +481,7 @@
         <w:rPr>
           <w:b/>
         </w:rPr>
-        <w:t>7.2. Naturaleza de la prestación.</w:t>
+        <w:t>8.2. Naturaleza de la prestación.</w:t>
       </w:r>
     </w:p>
     <w:p>
@@ -408,7 +494,7 @@
         <w:rPr>
           <w:b/>
         </w:rPr>
-        <w:t>7.3. Responsabilidad de resultados.</w:t>
+        <w:t>8.3. Responsabilidad de resultados.</w:t>
       </w:r>
     </w:p>
     <w:p>
@@ -421,7 +507,7 @@
         <w:rPr>
           <w:b/>
         </w:rPr>
-        <w:t>7.4. Estándares de conducta y colaboración.</w:t>
+        <w:t>8.4. Estándares de conducta y colaboración.</w:t>
       </w:r>
     </w:p>
     <w:p>
@@ -444,17 +530,17 @@
         <w:rPr>
           <w:b/>
         </w:rPr>
-        <w:t>7.5. Régimen de sesiones y reprogramación de las mismas.</w:t>
+        <w:t>8.5. Régimen de sesiones y reprogramación de las mismas.</w:t>
       </w:r>
     </w:p>
     <w:p>
       <w:r>
-        <w:t>(a) Carga de gestión: EL CONTRATANTE debe gestionar activamente la reserva y uso de las sesiones dentro del plazo de vigencia establecido en la CLÁUSULA QUINTA. La falta de uso por causas imputables a EL CONTRATANTE no generará derecho a prórroga, compensación ni reembolso.</w:t>
+        <w:t>(a) Carga de gestión: EL CONTRATANTE debe gestionar activamente la reserva y uso de las sesiones dentro del plazo de vigencia establecido en la CLÁUSULA SEXTA. La falta de uso por causas imputables a EL CONTRATANTE no generará derecho a prórroga, compensación ni reembolso.</w:t>
       </w:r>
     </w:p>
     <w:p>
       <w:r>
-        <w:t>(b) Aviso de reprogramación: para reprogramar una sesión individual, EL CONTRATANTE deberá notificar a LA EMPRESA con un mínimo de 48 (CUARENTA Y OCHO) horas hábiles de anticipación de acuerdo con lo dispuesto en la CLÁUSULA DÉCIMO QUINTA.</w:t>
+        <w:t>(b) Aviso de reprogramación: para reprogramar una sesión individual, EL CONTRATANTE deberá notificar a LA EMPRESA con un mínimo de 48 (CUARENTA Y OCHO) horas hábiles de anticipación de acuerdo con lo dispuesto en la CLÁUSULA DÉCIMO SEXTA.</w:t>
       </w:r>
     </w:p>
     <w:p>
@@ -470,7 +556,7 @@
         <w:rPr>
           <w:b/>
         </w:rPr>
-        <w:t>CLÁUSULA OCTAVA: AUDITORÍA DE INFORMACIÓN Y SEGUIMIENTO COMERCIAL</w:t>
+        <w:t>CLÁUSULA NOVENA: AUDITORÍA DE INFORMACIÓN Y SEGUIMIENTO COMERCIAL</w:t>
       </w:r>
     </w:p>
     <w:p>
@@ -478,12 +564,12 @@
         <w:rPr>
           <w:b/>
         </w:rPr>
-        <w:t>8.1. Derecho de auditoría.</w:t>
+        <w:t>9.1. Derecho de auditoría.</w:t>
       </w:r>
     </w:p>
     <w:p>
       <w:r>
-        <w:t>Dada la naturaleza de los servicios y el esquema de inversión pactado, EL CONTRATANTE reconoce que LA EMPRESA podrá solicitar en cualquier momento información sobre su situación comercial, el desarrollo de las campañas publicitarias, avances en el proceso de prospección, respuestas a mensajes recibidos, todo ello a través de los canales oficiales del programa de consultoría.</w:t>
+        <w:t>Dada la naturaleza de los servicios y el esquema de inversión pactado, EL CONTRATANTE reconoce que LA EMPRESA podrá solicitar en cualquier momento información sobre su situación comercial, el desarrollo de las campañas publicitarias, avances en el proceso de prospección y respuestas a mensajes recibidos, todo ello a través de los canales oficiales del programa de consultoría.</w:t>
       </w:r>
     </w:p>
     <w:p>
@@ -491,7 +577,7 @@
         <w:rPr>
           <w:b/>
         </w:rPr>
-        <w:t>8.2. Deber de respuesta y plazos.</w:t>
+        <w:t>9.2. Deber de respuesta y plazos.</w:t>
       </w:r>
     </w:p>
     <w:p>
@@ -507,7 +593,7 @@
         <w:rPr>
           <w:b/>
         </w:rPr>
-        <w:t>CLÁUSULA NOVENA: PROPIEDAD INTELECTUAL Y CONFIDENCIALIDAD</w:t>
+        <w:t>CLÁUSULA DÉCIMA: PROPIEDAD INTELECTUAL Y CONFIDENCIALIDAD</w:t>
       </w:r>
     </w:p>
     <w:p>
@@ -515,7 +601,7 @@
         <w:rPr>
           <w:b/>
         </w:rPr>
-        <w:t>9.1. Definición de información confidencial.</w:t>
+        <w:t>10.1. Definición de información confidencial.</w:t>
       </w:r>
     </w:p>
     <w:p>
@@ -573,7 +659,7 @@
         <w:rPr>
           <w:b/>
         </w:rPr>
-        <w:t>9.2. Titularidad de la propiedad intelectual.</w:t>
+        <w:t>10.2. Titularidad de la propiedad intelectual.</w:t>
       </w:r>
     </w:p>
     <w:p>
@@ -586,7 +672,7 @@
         <w:rPr>
           <w:b/>
         </w:rPr>
-        <w:t>9.3. Incumplimiento y sanciones.</w:t>
+        <w:t>10.3. Incumplimiento y sanciones.</w:t>
       </w:r>
     </w:p>
     <w:p>
@@ -614,7 +700,7 @@
         <w:rPr>
           <w:b/>
         </w:rPr>
-        <w:t>9.4. Excepciones a la obligación de confidencialidad.</w:t>
+        <w:t>10.4. Excepciones a la obligación de confidencialidad.</w:t>
       </w:r>
     </w:p>
     <w:p>
@@ -672,7 +758,7 @@
         <w:rPr>
           <w:b/>
         </w:rPr>
-        <w:t>9.5. Duración de la obligación.</w:t>
+        <w:t>10.5. Duración de la obligación.</w:t>
       </w:r>
     </w:p>
     <w:p>
@@ -685,7 +771,7 @@
         <w:rPr>
           <w:b/>
         </w:rPr>
-        <w:t>9.6. Uso de imagen y testimonios.</w:t>
+        <w:t>10.6. Uso de imagen y testimonios.</w:t>
       </w:r>
     </w:p>
     <w:p>
@@ -698,7 +784,7 @@
         <w:rPr>
           <w:b/>
         </w:rPr>
-        <w:t>9.7. Registro de comunicaciones.</w:t>
+        <w:t>10.7. Registro de comunicaciones.</w:t>
       </w:r>
     </w:p>
     <w:p>
@@ -714,7 +800,7 @@
         <w:rPr>
           <w:b/>
         </w:rPr>
-        <w:t>CLÁUSULA DÉCIMA: INDEMNIDAD Y LIMITACIÓN DE RESPONSABILIDAD</w:t>
+        <w:t>CLÁUSULA DÉCIMO PRIMERA: INDEMNIDAD Y LIMITACIÓN DE RESPONSABILIDAD</w:t>
       </w:r>
     </w:p>
     <w:p>
@@ -722,7 +808,7 @@
         <w:rPr>
           <w:b/>
         </w:rPr>
-        <w:t>10.1. Obligación de indemnidad de EL CONTRATANTE.</w:t>
+        <w:t>11.1. Obligación de indemnidad de EL CONTRATANTE.</w:t>
       </w:r>
     </w:p>
     <w:p>
@@ -759,7 +845,7 @@
         <w:rPr>
           <w:b/>
         </w:rPr>
-        <w:t>10.2. Obligación de indemnidad de LA EMPRESA.</w:t>
+        <w:t>11.2. Obligación de indemnidad de LA EMPRESA.</w:t>
       </w:r>
     </w:p>
     <w:p>
@@ -788,7 +874,7 @@
         <w:rPr>
           <w:b/>
         </w:rPr>
-        <w:t>10.3. Límite monetario.</w:t>
+        <w:t>11.3. Límite monetario.</w:t>
       </w:r>
     </w:p>
     <w:p>
@@ -801,7 +887,7 @@
         <w:rPr>
           <w:b/>
         </w:rPr>
-        <w:t>10.4. Exclusión de daños indirectos.</w:t>
+        <w:t>11.4. Exclusión de daños indirectos.</w:t>
       </w:r>
     </w:p>
     <w:p>
@@ -814,7 +900,7 @@
         <w:rPr>
           <w:b/>
         </w:rPr>
-        <w:t>10.5. Naturaleza esencial de las limitaciones.</w:t>
+        <w:t>11.5. Naturaleza esencial de las limitaciones.</w:t>
       </w:r>
     </w:p>
     <w:p>
@@ -827,7 +913,7 @@
         <w:rPr>
           <w:b/>
         </w:rPr>
-        <w:t>10.6. Procedimiento.</w:t>
+        <w:t>11.6. Procedimiento.</w:t>
       </w:r>
     </w:p>
     <w:p>
@@ -843,7 +929,7 @@
         <w:rPr>
           <w:b/>
         </w:rPr>
-        <w:t>CLÁUSULA DÉCIMO PRIMERA: EXIMENTES DE RESPONSABILIDAD</w:t>
+        <w:t>CLÁUSULA DÉCIMO SEGUNDA: EXIMENTES DE RESPONSABILIDAD</w:t>
       </w:r>
     </w:p>
     <w:p>
@@ -851,7 +937,7 @@
         <w:rPr>
           <w:b/>
         </w:rPr>
-        <w:t>11.1. Caso fortuito, fuerza mayor e imposibilidad sobreviniente.</w:t>
+        <w:t>12.1. Caso fortuito, fuerza mayor e imposibilidad sobreviniente.</w:t>
       </w:r>
     </w:p>
     <w:p>
@@ -864,7 +950,7 @@
         <w:rPr>
           <w:b/>
         </w:rPr>
-        <w:t>11.2. Efectos.</w:t>
+        <w:t>12.2. Efectos.</w:t>
       </w:r>
     </w:p>
     <w:p>
@@ -877,7 +963,7 @@
         <w:rPr>
           <w:b/>
         </w:rPr>
-        <w:t>11.3. Suspensión.</w:t>
+        <w:t>12.3. Suspensión.</w:t>
       </w:r>
     </w:p>
     <w:p>
@@ -917,7 +1003,7 @@
         <w:rPr>
           <w:b/>
         </w:rPr>
-        <w:t>CLÁUSULA DÉCIMO SEGUNDA: RESCISIÓN Y RESOLUCIÓN CONTRACTUAL</w:t>
+        <w:t>CLÁUSULA DÉCIMO TERCERA: RESCISIÓN Y RESOLUCIÓN CONTRACTUAL</w:t>
       </w:r>
     </w:p>
     <w:p>
@@ -925,12 +1011,12 @@
         <w:rPr>
           <w:b/>
         </w:rPr>
-        <w:t>12.1. Renuncia a la compensación por rescisión unilateral sin causa.</w:t>
+        <w:t>13.1. Renuncia a la compensación por rescisión unilateral sin causa.</w:t>
       </w:r>
     </w:p>
     <w:p>
       <w:r>
-        <w:t>LAS PARTES renuncian expresamente a la facultad de ser compensadas al rescindir unilateralmente el presente contrato sin que medie justa causa. EL CONTRATANTE reconoce que los servicios de consultoría y el acceso a la propiedad intelectual de LA EMPRESA se brindan de forma integral desde el inicio, por lo que la interrupción voluntaria por parte de EL CONTRATANTE no lo exime de abonar la totalidad de los honorarios pactados en la CLÁUSULA TERCERA, ni lo legitima a ser beneficiario de compensación alguna.</w:t>
+        <w:t>LAS PARTES renuncian expresamente a la facultad de ser compensadas al rescindir unilateralmente el presente contrato sin que medie justa causa. EL CONTRATANTE reconoce que los servicios de consultoría y el acceso a la propiedad intelectual de LA EMPRESA se brindan de forma integral desde el inicio, por lo que la interrupción voluntaria por parte de EL CONTRATANTE no lo exime de abonar la totalidad de los honorarios pactados en la CLÁUSULA TERCERA, ni lo legitima a ser beneficiario de compensación alguna. El derecho de salida voluntaria previsto en la CLÁUSULA CUARTA constituye la única excepción a la presente renuncia, y solo puede ejercerse dentro del plazo y con los efectos allí previstos.</w:t>
       </w:r>
     </w:p>
     <w:p>
@@ -938,7 +1024,7 @@
         <w:rPr>
           <w:b/>
         </w:rPr>
-        <w:t>12.2. Resolución por incumplimiento.</w:t>
+        <w:t>13.2. Resolución por incumplimiento.</w:t>
       </w:r>
     </w:p>
     <w:p>
@@ -956,7 +1042,7 @@
         <w:pStyle w:val="ListBullet"/>
       </w:pPr>
       <w:r>
-        <w:t>Por parte de EL CONTRATANTE: la mora en el pago por más de 10 (DIEZ) días hábiles; la violación de las normas de propiedad intelectual o confidencialidad; y el incumplimiento reiterado de los deberes de colaboración, respuesta y provisión de información previstos en las CLÁUSULAS SEGUNDA y OCTAVA.</w:t>
+        <w:t>Por parte de EL CONTRATANTE: la mora en el pago por más de 10 (DIEZ) días hábiles; la violación de las normas de propiedad intelectual o confidencialidad; y el incumplimiento reiterado de los deberes de colaboración, respuesta y provisión de información previstos en las CLÁUSULAS SEGUNDA y NOVENA.</w:t>
       </w:r>
     </w:p>
     <w:p>
@@ -964,12 +1050,12 @@
         <w:pStyle w:val="ListBullet"/>
       </w:pPr>
       <w:r>
-        <w:t>Por parte de LA EMPRESA: la falta de prestación de los servicios detallados en el Anexo I sin causa justificada por más de 10 (DIEZ) días hábiles; la violación grave de las obligaciones de confidencialidad establecidas en la CLÁUSULA NOVENA; el uso indebido de la información, materiales o documentación que EL CONTRATANTE le hubiera proporcionado en el marco de la ejecución del contrato; y el incumplimiento reiterado del procedimiento de restitución y eliminación de información previsto en el apartado 12.4.</w:t>
+        <w:t>Por parte de LA EMPRESA: la falta de prestación de los servicios detallados en el Anexo I sin causa justificada por más de 10 (DIEZ) días hábiles; la violación grave de las obligaciones de confidencialidad establecidas en la CLÁUSULA DÉCIMA; el uso indebido de la información, materiales o documentación que EL CONTRATANTE le hubiera proporcionado en el marco de la ejecución del contrato; y el incumplimiento reiterado del procedimiento de restitución y eliminación de información previsto en el apartado 13.4.</w:t>
       </w:r>
     </w:p>
     <w:p>
       <w:r>
-        <w:t>(b) Procedimiento de subsanación: la parte cumplidora deberá intimar a la incumplidora mediante notificación fehaciente conforme a lo dispuesto en la CLÁUSULA DÉCIMO QUINTA para que subsane el incumplimiento en un plazo de 10 (DIEZ) días hábiles. Si vencido el plazo la falta persiste, el contrato se resolverá de pleno derecho.</w:t>
+        <w:t>(b) Procedimiento de subsanación: la parte cumplidora deberá intimar a la incumplidora mediante notificación fehaciente conforme a lo dispuesto en la CLÁUSULA DÉCIMO SEXTA para que subsane el incumplimiento en un plazo de 10 (DIEZ) días hábiles. Si vencido el plazo la falta persiste, el contrato se resolverá de pleno derecho.</w:t>
       </w:r>
     </w:p>
     <w:p>
@@ -982,7 +1068,7 @@
         <w:rPr>
           <w:b/>
         </w:rPr>
-        <w:t>12.3. Supervivencia de cláusulas.</w:t>
+        <w:t>13.3. Supervivencia de cláusulas.</w:t>
       </w:r>
     </w:p>
     <w:p>
@@ -995,7 +1081,7 @@
         <w:pStyle w:val="ListBullet"/>
       </w:pPr>
       <w:r>
-        <w:t>Propiedad intelectual y titularidad sobre los contenidos generados durante la prestación (CLÁUSULA NOVENA).</w:t>
+        <w:t>Propiedad intelectual y titularidad sobre los contenidos generados durante la prestación (CLÁUSULA DÉCIMA).</w:t>
       </w:r>
     </w:p>
     <w:p>
@@ -1003,7 +1089,7 @@
         <w:pStyle w:val="ListBullet"/>
       </w:pPr>
       <w:r>
-        <w:t>Confidencialidad y sus excepciones, por el plazo allí establecido (CLÁUSULA NOVENA).</w:t>
+        <w:t>Confidencialidad y sus excepciones, por el plazo allí establecido (CLÁUSULA DÉCIMA).</w:t>
       </w:r>
     </w:p>
     <w:p>
@@ -1011,7 +1097,7 @@
         <w:pStyle w:val="ListBullet"/>
       </w:pPr>
       <w:r>
-        <w:t>Indemnidad y limitación de responsabilidad (CLÁUSULA DÉCIMA).</w:t>
+        <w:t>Indemnidad y limitación de responsabilidad (CLÁUSULA DÉCIMO PRIMERA).</w:t>
       </w:r>
     </w:p>
     <w:p>
@@ -1019,7 +1105,7 @@
         <w:pStyle w:val="ListBullet"/>
       </w:pPr>
       <w:r>
-        <w:t>Restitución y eliminación de información (apartado 12.4).</w:t>
+        <w:t>Restitución y eliminación de información (apartado 13.4).</w:t>
       </w:r>
     </w:p>
     <w:p>
@@ -1035,7 +1121,7 @@
         <w:pStyle w:val="ListBullet"/>
       </w:pPr>
       <w:r>
-        <w:t>Jurisdicción, derecho aplicable y mecanismos de resolución de controversias (CLÁUSULA DÉCIMO SEXTA).</w:t>
+        <w:t>Jurisdicción, derecho aplicable y mecanismos de resolución de controversias (CLÁUSULA DÉCIMO SÉPTIMA).</w:t>
       </w:r>
     </w:p>
     <w:p>
@@ -1051,7 +1137,7 @@
         <w:rPr>
           <w:b/>
         </w:rPr>
-        <w:t>12.4. Restitución y eliminación de información al término del contrato.</w:t>
+        <w:t>13.4. Restitución y eliminación de información al término del contrato.</w:t>
       </w:r>
     </w:p>
     <w:p>
@@ -1061,7 +1147,7 @@
     </w:p>
     <w:p>
       <w:r>
-        <w:t>(b) Excepciones por obligación legal: no obstante lo anterior, cada parte podrá conservar aquellas copias de la Información Confidencial cuya retención sea estrictamente necesaria para el cumplimiento de obligaciones legales, fiscales, contables o regulatorias, o para la defensa de sus derechos en sede judicial o administrativa. La información así retenida permanecerá sujeta a las obligaciones de confidencialidad establecidas en la CLÁUSULA NOVENA por todo el tiempo en que subsista dicha retención.</w:t>
+        <w:t>(b) Excepciones por obligación legal: no obstante lo anterior, cada parte podrá conservar aquellas copias de la Información Confidencial cuya retención sea estrictamente necesaria para el cumplimiento de obligaciones legales, fiscales, contables o regulatorias, o para la defensa de sus derechos en sede judicial o administrativa. La información así retenida permanecerá sujeta a las obligaciones de confidencialidad establecidas en la CLÁUSULA DÉCIMA por todo el tiempo en que subsista dicha retención.</w:t>
       </w:r>
     </w:p>
     <w:p>
@@ -1072,7 +1158,7 @@
         <w:rPr>
           <w:b/>
         </w:rPr>
-        <w:t>CLÁUSULA DÉCIMO TERCERA: NATURALEZA DE LA RELACIÓN</w:t>
+        <w:t>CLÁUSULA DÉCIMO CUARTA: NATURALEZA DE LA RELACIÓN</w:t>
       </w:r>
     </w:p>
     <w:p>
@@ -1080,7 +1166,7 @@
         <w:rPr>
           <w:b/>
         </w:rPr>
-        <w:t>13.1. Independencia de las partes.</w:t>
+        <w:t>14.1. Independencia de las partes.</w:t>
       </w:r>
     </w:p>
     <w:p>
@@ -1093,7 +1179,7 @@
         <w:rPr>
           <w:b/>
         </w:rPr>
-        <w:t>13.2. Ausencia de subordinación.</w:t>
+        <w:t>14.2. Ausencia de subordinación.</w:t>
       </w:r>
     </w:p>
     <w:p>
@@ -1106,7 +1192,7 @@
         <w:rPr>
           <w:b/>
         </w:rPr>
-        <w:t>13.3. Personal afectado.</w:t>
+        <w:t>14.3. Personal afectado.</w:t>
       </w:r>
     </w:p>
     <w:p>
@@ -1122,7 +1208,7 @@
         <w:rPr>
           <w:b/>
         </w:rPr>
-        <w:t>CLÁUSULA DÉCIMO CUARTA: SUBCONTRATACIÓN</w:t>
+        <w:t>CLÁUSULA DÉCIMO QUINTA: SUBCONTRATACIÓN</w:t>
       </w:r>
     </w:p>
     <w:p>
@@ -1130,7 +1216,7 @@
         <w:rPr>
           <w:b/>
         </w:rPr>
-        <w:t>14.1. Facultad de subcontratar.</w:t>
+        <w:t>15.1. Facultad de subcontratar.</w:t>
       </w:r>
     </w:p>
     <w:p>
@@ -1143,7 +1229,7 @@
         <w:rPr>
           <w:b/>
         </w:rPr>
-        <w:t>14.2. Responsabilidad de LA EMPRESA.</w:t>
+        <w:t>15.2. Responsabilidad de LA EMPRESA.</w:t>
       </w:r>
     </w:p>
     <w:p>
@@ -1156,12 +1242,12 @@
         <w:rPr>
           <w:b/>
         </w:rPr>
-        <w:t>14.3. Extensión de obligaciones a subcontratistas.</w:t>
+        <w:t>15.3. Extensión de obligaciones a subcontratistas.</w:t>
       </w:r>
     </w:p>
     <w:p>
       <w:r>
-        <w:t>LA EMPRESA garantiza que todo subcontratista que afecte a la prestación del servicio se encontrará vinculado por obligaciones de confidencialidad y propiedad intelectual de alcance equivalente a las establecidas en la CLÁUSULA NOVENA, debiendo instrumentarse por escrito con anterioridad al acceso del subcontratista a cualquier información de EL CONTRATANTE. El incumplimiento de esta obligación por parte de un subcontratista será considerado incumplimiento directo de LA EMPRESA frente a EL CONTRATANTE.</w:t>
+        <w:t>LA EMPRESA garantiza que todo subcontratista que afecte a la prestación del servicio se encontrará vinculado por obligaciones de confidencialidad y propiedad intelectual de alcance equivalente a las establecidas en la CLÁUSULA DÉCIMA, debiendo instrumentarse por escrito con anterioridad al acceso del subcontratista a cualquier información de EL CONTRATANTE. El incumplimiento de esta obligación por parte de un subcontratista será considerado incumplimiento directo de LA EMPRESA frente a EL CONTRATANTE.</w:t>
       </w:r>
     </w:p>
     <w:p>
@@ -1172,7 +1258,7 @@
         <w:rPr>
           <w:b/>
         </w:rPr>
-        <w:t>CLÁUSULA DÉCIMO QUINTA: CANALES DE COMUNICACIÓN Y CAMBIOS EN EL DOMICILIO</w:t>
+        <w:t>CLÁUSULA DÉCIMO SEXTA: CANALES DE COMUNICACIÓN Y CAMBIOS EN EL DOMICILIO</w:t>
       </w:r>
     </w:p>
     <w:p>
@@ -1180,7 +1266,7 @@
         <w:rPr>
           <w:b/>
         </w:rPr>
-        <w:t>15.1. Domicilios constituidos.</w:t>
+        <w:t>16.1. Domicilios constituidos.</w:t>
       </w:r>
     </w:p>
     <w:p>
@@ -1193,12 +1279,12 @@
         <w:rPr>
           <w:b/>
         </w:rPr>
-        <w:t>15.2. Canal de comunicación.</w:t>
+        <w:t>16.2. Canal de comunicación.</w:t>
       </w:r>
     </w:p>
     <w:p>
       <w:r>
-        <w:t>Las notificaciones de naturaleza legal —incluyendo intimaciones, requerimientos de subsanación, comunicaciones de rescisión o resolución— deberán cursarse por correo electrónico a las casillas constituidas en la presente cláusula. Las aplicaciones de mensajería instantánea se reservan para comunicaciones operativas vinculadas a la prestación del servicio.</w:t>
+        <w:t>Las notificaciones de naturaleza legal —incluyendo intimaciones, requerimientos de subsanación, comunicaciones de rescisión o resolución, y el ejercicio del derecho de salida voluntaria previsto en la CLÁUSULA CUARTA— deberán cursarse por correo electrónico a las casillas constituidas en la presente cláusula. Las aplicaciones de mensajería instantánea se reservan para comunicaciones operativas vinculadas a la prestación del servicio.</w:t>
       </w:r>
     </w:p>
     <w:p>
@@ -1216,7 +1302,7 @@
         <w:rPr>
           <w:b/>
         </w:rPr>
-        <w:t>15.3. Cambio de domicilio y/o correo electrónico.</w:t>
+        <w:t>16.3. Cambio de domicilio y/o correo electrónico.</w:t>
       </w:r>
     </w:p>
     <w:p>
@@ -1232,7 +1318,7 @@
         <w:rPr>
           <w:b/>
         </w:rPr>
-        <w:t>CLÁUSULA DÉCIMO SEXTA: JURISDICCIÓN Y DERECHO APLICABLE</w:t>
+        <w:t>CLÁUSULA DÉCIMO SÉPTIMA: JURISDICCIÓN Y DERECHO APLICABLE</w:t>
       </w:r>
     </w:p>
     <w:p>
@@ -1240,7 +1326,7 @@
         <w:rPr>
           <w:b/>
         </w:rPr>
-        <w:t>16.1. Compromiso de solución amistosa.</w:t>
+        <w:t>17.1. Compromiso de solución amistosa.</w:t>
       </w:r>
     </w:p>
     <w:p>
@@ -1253,7 +1339,7 @@
         <w:rPr>
           <w:b/>
         </w:rPr>
-        <w:t>16.2. Jurisdicción internacional directa.</w:t>
+        <w:t>17.2. Jurisdicción internacional directa.</w:t>
       </w:r>
     </w:p>
     <w:p>
@@ -1266,7 +1352,7 @@
         <w:rPr>
           <w:b/>
         </w:rPr>
-        <w:t>16.3. Derecho aplicable.</w:t>
+        <w:t>17.3. Derecho aplicable.</w:t>
       </w:r>
     </w:p>
     <w:p>
@@ -1279,7 +1365,7 @@
         <w:rPr>
           <w:b/>
         </w:rPr>
-        <w:t>16.4. Renuncia a flexibilización.</w:t>
+        <w:t>17.4. Renuncia a flexibilización.</w:t>
       </w:r>
     </w:p>
     <w:p>
@@ -1292,7 +1378,7 @@
         <w:rPr>
           <w:b/>
         </w:rPr>
-        <w:t>16.5. Divisibilidad.</w:t>
+        <w:t>17.5. Divisibilidad.</w:t>
       </w:r>
     </w:p>
     <w:p>
@@ -1305,7 +1391,7 @@
         <w:rPr>
           <w:b/>
         </w:rPr>
-        <w:t>16.6. Validez de la firma digital.</w:t>
+        <w:t>17.6. Validez de la firma digital.</w:t>
       </w:r>
     </w:p>
     <w:p>
@@ -1321,7 +1407,7 @@
         <w:rPr>
           <w:b/>
         </w:rPr>
-        <w:t>CLÁUSULA DÉCIMO SÉPTIMA: INTEGRIDAD DEL ACUERDO Y MODIFICACIONES</w:t>
+        <w:t>CLÁUSULA DÉCIMO OCTAVA: INTEGRIDAD DEL ACUERDO Y MODIFICACIONES</w:t>
       </w:r>
     </w:p>
     <w:p>
@@ -1329,7 +1415,7 @@
         <w:rPr>
           <w:b/>
         </w:rPr>
-        <w:t>17.1. Integridad del acuerdo.</w:t>
+        <w:t>18.1. Integridad del acuerdo.</w:t>
       </w:r>
     </w:p>
     <w:p>
@@ -1342,7 +1428,20 @@
         <w:rPr>
           <w:b/>
         </w:rPr>
-        <w:t>17.2. Inexistencia de acuerdos paralelos.</w:t>
+        <w:t>18.2. Registro de la negociación.</w:t>
+      </w:r>
+    </w:p>
+    <w:p>
+      <w:r>
+        <w:t>LAS PARTES reconocen que la reunión celebrada el 26 de octubre de 2026, registrada y disponible en el enlace https://fathom.video/share/36HzqFF9frVp-Lp-Q1MyfCYiXLxPHZs-, así como las reuniones y comunicaciones de seguimiento celebradas entre LAS PARTES con posterioridad a dicha fecha, constituyen antecedentes documentales de los términos negociados, conforme se detalla en el Anexo II. En caso de discrepancia entre dichos registros y el presente contrato o sus anexos, prevalecerá lo establecido en estos últimos.</w:t>
+      </w:r>
+    </w:p>
+    <w:p>
+      <w:r>
+        <w:rPr>
+          <w:b/>
+        </w:rPr>
+        <w:t>18.3. Inexistencia de acuerdos paralelos.</w:t>
       </w:r>
     </w:p>
     <w:p>
@@ -1355,7 +1454,7 @@
         <w:rPr>
           <w:b/>
         </w:rPr>
-        <w:t>17.3. Modificaciones.</w:t>
+        <w:t>18.4. Modificaciones.</w:t>
       </w:r>
     </w:p>
     <w:p>
@@ -1400,7 +1499,7 @@
           <w:b/>
           <w:sz w:val="26"/>
         </w:rPr>
-        <w:t>PROGRAMA “ACOMPAÑAMIENTO PERSONALIZADO” (3 MESES)</w:t>
+        <w:t>PROGRAMA “ACOMPAÑAMIENTO PERSONALIZADO” (3 MESES, EN DOS FASES)</w:t>
       </w:r>
     </w:p>
     <w:p/>
@@ -1419,7 +1518,7 @@
     </w:p>
     <w:p>
       <w:r>
-        <w:t>El presente Anexo regula el alcance, los componentes y las condiciones operativas del Programa de Acompañamiento Personalizado (en adelante, el “Programa”), que LA EMPRESA prestará a EL CONTRATANTE durante la vigencia de TRES (3) meses establecida en la CLÁUSULA QUINTA del contrato principal. La prestación se rige por la CLÁUSULA SEXTA del contrato principal.</w:t>
+        <w:t>El presente Anexo regula el alcance, los componentes y las condiciones operativas del Programa de Acompañamiento Personalizado (en adelante, el “Programa”), que LA EMPRESA prestará a EL CONTRATANTE durante la vigencia de TRES (3) meses establecida en la CLÁUSULA SEXTA del contrato principal, estructurado en dos (2) fases conforme la CLÁUSULA CUARTA del contrato principal. La prestación se rige por la CLÁUSULA SÉPTIMA del contrato principal.</w:t>
       </w:r>
     </w:p>
     <w:p>
@@ -1427,12 +1526,12 @@
         <w:rPr>
           <w:b/>
         </w:rPr>
-        <w:t>2. SESIONES INDIVIDUALES UNO A UNO</w:t>
+        <w:t>2. FASE 1 — PRIMEROS TREINTA (30) DÍAS</w:t>
       </w:r>
     </w:p>
     <w:p>
       <w:r>
-        <w:t>Dentro de los primeros TREINTA (30) días corridos contados desde la fecha del primer pago, EL CONTRATANTE recibirá tres (3) sesiones individuales uno a uno por videoconferencia, conforme la siguiente estructura:</w:t>
+        <w:t>Desde la fecha del primer pago y hasta el vencimiento del plazo de la SEGUNDA CUOTA, EL CONTRATANTE tendrá acceso a:</w:t>
       </w:r>
     </w:p>
     <w:p>
@@ -1440,7 +1539,7 @@
         <w:pStyle w:val="ListBullet"/>
       </w:pPr>
       <w:r>
-        <w:t>SESIÓN 1 — Diagnóstico y roadmap personalizado: sesión con un integrante del equipo directivo de LA EMPRESA destinada al desglose del negocio o los negocios de EL CONTRATANTE, la identificación de sus cuellos de botella y la elaboración de un roadmap personalizado de implementación, entregado por escrito.</w:t>
+        <w:t>Plataforma y sistemas: acceso a la plataforma de LA EMPRESA con los SOPs, procesos documentados, sistemas, templates y videos que LA EMPRESA designe conforme el diagnóstico realizado.</w:t>
       </w:r>
     </w:p>
     <w:p>
@@ -1448,7 +1547,7 @@
         <w:pStyle w:val="ListBullet"/>
       </w:pPr>
       <w:r>
-        <w:t>SESIÓN 2 — Ventas y cierre: sesión destinada a la optimización de los procesos de venta de EL CONTRATANTE, incluyendo la revisión de sus guiones o scripts de cierre, la revisión de reuniones grabadas cuando EL CONTRATANTE las provea, y coaching sobre su desempeño comercial.</w:t>
+        <w:t>Sesión de roadmap inicial: una (1) sesión individual uno a uno con el integrante del equipo de LA EMPRESA designado al efecto, destinada al desglose del negocio o los negocios de EL CONTRATANTE, la identificación de sus cuellos de botella y la elaboración de un roadmap personalizado de implementación, entregado por escrito.</w:t>
       </w:r>
     </w:p>
     <w:p>
@@ -1456,7 +1555,12 @@
         <w:pStyle w:val="ListBullet"/>
       </w:pPr>
       <w:r>
-        <w:t>SESIÓN 3 — Anuncios y adquisición: sesión destinada a la revisión de las campañas publicitarias de EL CONTRATANTE, los ángulos de comunicación, la estructura de cuentas y la optimización del funnel de adquisición.</w:t>
+        <w:t>Acompañamiento continuo: soporte mediante el grupo de WhatsApp designado por LA EMPRESA y canal directo de comunicación, durante toda la vigencia del Programa.</w:t>
+      </w:r>
+    </w:p>
+    <w:p>
+      <w:r>
+        <w:t>El acceso a la plataforma es personal del titular del contrato y no incluye integrantes de su equipo.</w:t>
       </w:r>
     </w:p>
     <w:p>
@@ -1464,12 +1568,12 @@
         <w:rPr>
           <w:b/>
         </w:rPr>
-        <w:t>3. ACCESOS Y MATERIALES</w:t>
+        <w:t>3. FASE 2 — DESBLOQUEADA CON EL INGRESO EFECTIVO DE LA SEGUNDA CUOTA</w:t>
       </w:r>
     </w:p>
     <w:p>
       <w:r>
-        <w:t>Durante la vigencia del Programa, EL CONTRATANTE tendrá acceso a:</w:t>
+        <w:t>A partir del ingreso efectivo de la SEGUNDA CUOTA, se habilitan las siguientes sesiones individuales:</w:t>
       </w:r>
     </w:p>
     <w:p>
@@ -1477,7 +1581,7 @@
         <w:pStyle w:val="ListBullet"/>
       </w:pPr>
       <w:r>
-        <w:t>Los procesos documentados, SOPs, templates, sistemas y videos que LA EMPRESA designe conforme el diagnóstico realizado.</w:t>
+        <w:t>Sesión de marketing: se ejecutará aproximadamente a los CUARENTA Y CINCO (45) días corridos contados desde la fecha del primer pago y, en todo caso, con posterioridad al ingreso efectivo de la SEGUNDA CUOTA. Está destinada a la revisión de las métricas de contenido y resultados de cada uno de los clientes de EL CONTRATANTE, la identificación de qué está funcionando y qué no, y la definición de los ajustes a implementar sobre esa base.</w:t>
       </w:r>
     </w:p>
     <w:p>
@@ -1485,12 +1589,12 @@
         <w:pStyle w:val="ListBullet"/>
       </w:pPr>
       <w:r>
-        <w:t>Revisión y feedback, por escrito o en formato video, sobre las implementaciones que EL CONTRATANTE realice durante la vigencia del Programa.</w:t>
+        <w:t>Sesión electiva: EL CONTRATANTE podrá optar entre (i) una sesión de procesos de venta a profundidad, a cargo del área comercial de LA EMPRESA, o (ii) una sesión de anuncios y adquisición, destinada a la revisión de campañas publicitarias, ángulos de comunicación y estructura de cuentas. La elección será comunicada por EL CONTRATANTE a través de los canales designados y la sesión se agendará dentro de la vigencia del Programa.</w:t>
       </w:r>
     </w:p>
     <w:p>
       <w:r>
-        <w:t>El acceso es personal del titular del contrato y no incluye integrantes de su equipo.</w:t>
+        <w:t>El feedback sobre las implementaciones de EL CONTRATANTE se prestará, antes y entre las sesiones, mediante looms, material e intercambios remitidos por EL CONTRATANTE a través del grupo de WhatsApp o del canal directo.</w:t>
       </w:r>
     </w:p>
     <w:p>
@@ -1503,7 +1607,7 @@
     </w:p>
     <w:p>
       <w:r>
-        <w:t>Quedan expresamente excluidos del presente Programa, conforme la CLÁUSULA PRIMERA del contrato principal: (a) la atención de consultas por chat uno a uno mediante Discord o plataforma análoga. El canal privado de EL CONTRATANTE en la plataforma de LA EMPRESA se utilizará únicamente para coordinar las sesiones individuales previstas en el punto 2; (b) las clases en vivo, sean estas grupales o individuales, distintas de las tres (3) sesiones individuales previstas en el punto 2; y (c) todo otro componente perteneciente al programa “ENTRY LEVEL” de LA EMPRESA.</w:t>
+        <w:t>Quedan expresamente excluidos del presente Programa, conforme la CLÁUSULA PRIMERA del contrato principal: (a) el chat uno a uno mediante Discord o plataforma análoga; (b) las clases en vivo, sean estas grupales o individuales, distintas de las sesiones individuales previstas en los puntos 2 y 3; y (c) todo otro componente perteneciente al programa “ENTRY LEVEL” de LA EMPRESA.</w:t>
       </w:r>
     </w:p>
     <w:p>
@@ -1511,7 +1615,20 @@
         <w:rPr>
           <w:b/>
         </w:rPr>
-        <w:t>5. MECANISMO DE CRÉDITO HACIA EL PROGRAMA “ENTRY LEVEL”</w:t>
+        <w:t>5. EFECTOS DE LA SALIDA VOLUNTARIA SOBRE EL ALCANCE</w:t>
+      </w:r>
+    </w:p>
+    <w:p>
+      <w:r>
+        <w:t>En caso de ejercerse el derecho de salida voluntaria previsto en la CLÁUSULA CUARTA del contrato principal, EL CONTRATANTE conservará el acceso a la plataforma y a los materiales provistos durante la FASE 1, cesando las sesiones de la FASE 2 y el acompañamiento, conforme el apartado 4.3 del contrato principal.</w:t>
+      </w:r>
+    </w:p>
+    <w:p>
+      <w:r>
+        <w:rPr>
+          <w:b/>
+        </w:rPr>
+        <w:t>6. MECANISMO DE CRÉDITO HACIA EL PROGRAMA “ENTRY LEVEL”</w:t>
       </w:r>
     </w:p>
     <w:p>
@@ -1524,7 +1641,7 @@
         <w:rPr>
           <w:b/>
         </w:rPr>
-        <w:t>6. MODALIDAD DE IMPLEMENTACIÓN</w:t>
+        <w:t>7. MODALIDAD DE IMPLEMENTACIÓN</w:t>
       </w:r>
     </w:p>
     <w:p>
@@ -1537,12 +1654,12 @@
         <w:rPr>
           <w:b/>
         </w:rPr>
-        <w:t>7. PLAZO, ACCESO Y SOPORTE</w:t>
+        <w:t>8. PLAZO, ACCESO Y SOPORTE</w:t>
       </w:r>
     </w:p>
     <w:p>
       <w:r>
-        <w:t>El Programa se prestará durante el plazo previsto en la CLÁUSULA QUINTA del contrato principal. Las prestaciones se ejecutarán por las siguientes modalidades, conforme corresponda a cada componente:</w:t>
+        <w:t>El Programa se prestará durante el plazo previsto en la CLÁUSULA SEXTA del contrato principal. Las prestaciones se ejecutarán por las siguientes modalidades, conforme corresponda a cada componente:</w:t>
       </w:r>
     </w:p>
     <w:p>
@@ -1550,7 +1667,7 @@
         <w:pStyle w:val="ListBullet"/>
       </w:pPr>
       <w:r>
-        <w:t>Modalidad sincrónica en vivo: las tres (3) sesiones individuales por videoconferencia a través de la plataforma que LA EMPRESA designe.</w:t>
+        <w:t>Modalidad sincrónica en vivo: las sesiones individuales por videoconferencia a través de la plataforma que LA EMPRESA designe.</w:t>
       </w:r>
     </w:p>
     <w:p>
@@ -1566,11 +1683,37 @@
         <w:pStyle w:val="ListBullet"/>
       </w:pPr>
       <w:r>
-        <w:t>Modalidad escrita asincrónica: feedback por correo electrónico o por el canal que LA EMPRESA designe. Todo seguimiento, acompañamiento o soporte previsto en el presente Anexo se prestará dentro del plazo de vigencia del Programa y concluirá con su terminación.</w:t>
+        <w:t>Modalidad escrita asincrónica: acompañamiento por el grupo de WhatsApp, canal directo y correo electrónico. Todo seguimiento, acompañamiento o soporte previsto en el presente Anexo se prestará dentro del plazo de vigencia del Programa y concluirá con su terminación, sin perjuicio de lo dispuesto en el apartado 4.3 del contrato principal.</w:t>
+      </w:r>
+    </w:p>
+    <w:p>
+      <w:r>
+        <w:br w:type="page"/>
+      </w:r>
+    </w:p>
+    <w:p>
+      <w:pPr>
+        <w:jc w:val="center"/>
+      </w:pPr>
+      <w:r>
+        <w:rPr>
+          <w:b/>
+          <w:sz w:val="26"/>
+        </w:rPr>
+        <w:t>ANEXO II — REGISTRO DE LA NEGOCIACIÓN</w:t>
       </w:r>
     </w:p>
     <w:p/>
-    <w:p/>
+    <w:p>
+      <w:r>
+        <w:t>LAS PARTES reconocen que los términos del presente contrato, incluyendo la estructura de pagos en tres cuotas, el recargo por financiación, la estructura del Programa en dos fases con desbloqueo de sesiones por pago, el derecho de salida voluntaria a los Treinta (30) días sin pago de las cuotas restantes, la duración de TRES (3) meses del Programa, los componentes incluidos y excluidos, y el mecanismo de crédito hacia el programa “ENTRY LEVEL”, fueron negociados y acordados entre las partes en la reunión celebrada el 26 de octubre de 2026, registrada y disponible en el enlace https://fathom.video/share/36HzqFF9frVp-Lp-Q1MyfCYiXLxPHZs-, y en las reuniones y comunicaciones de seguimiento celebradas entre LAS PARTES con posterioridad a dicha fecha, en las cuales se acordó la dinámica de prueba del primer mes con salida voluntaria y el desbloqueo de las sesiones de marketing y ventas con el pago de la segunda cuota.</w:t>
+      </w:r>
+    </w:p>
+    <w:p>
+      <w:r>
+        <w:t>Dichos registros se incorporan al presente como antecedentes documentales de la negociación. En caso de discrepancia entre ellos y el presente contrato o sus anexos, prevalecerá lo establecido en estos últimos, conforme la CLÁUSULA DÉCIMO OCTAVA del contrato principal.</w:t>
+      </w:r>
+    </w:p>
     <w:sectPr>
       <w:pgSz w:w="12240" w:h="15840"/>
       <w:pgMar w:top="1440" w:right="1800" w:bottom="1440" w:left="1800" w:header="720" w:footer="720" w:gutter="0"/>

</xml_diff>